<commit_message>
feat: add metadata ablation and refresh delivery
</commit_message>
<xml_diff>
--- a/deliverables/financial_performance_prediction_report.docx
+++ b/deliverables/financial_performance_prediction_report.docx
@@ -2554,7 +2554,7 @@
               <w:rPr>
                 <w:b w:val="0"/>
               </w:rPr>
-              <w:t>5.491926</w:t>
+              <w:t>18.989362</w:t>
             </w:r>
           </w:p>
         </w:tc>
@@ -2640,7 +2640,7 @@
               <w:rPr>
                 <w:b w:val="0"/>
               </w:rPr>
-              <w:t>5.491926</w:t>
+              <w:t>18.989362</w:t>
             </w:r>
           </w:p>
         </w:tc>
@@ -2914,7 +2914,7 @@
               <w:rPr>
                 <w:b w:val="0"/>
               </w:rPr>
-              <w:t>M3_catboost_direct_history_metadata_engineered</w:t>
+              <w:t>M3d_catboost_direct_history_metadata_engineered</w:t>
             </w:r>
           </w:p>
         </w:tc>
@@ -2984,7 +2984,265 @@
               <w:rPr>
                 <w:b w:val="0"/>
               </w:rPr>
-              <w:t>554.514580</w:t>
+              <w:t>639.231824</w:t>
+            </w:r>
+          </w:p>
+        </w:tc>
+      </w:tr>
+      <w:tr>
+        <w:tc>
+          <w:tcPr>
+            <w:tcW w:type="dxa" w:w="1625"/>
+          </w:tcPr>
+          <w:p>
+            <w:r/>
+            <w:r>
+              <w:rPr>
+                <w:b w:val="0"/>
+              </w:rPr>
+              <w:t>M3c_catboost_direct_history_metadata</w:t>
+            </w:r>
+          </w:p>
+        </w:tc>
+        <w:tc>
+          <w:tcPr>
+            <w:tcW w:type="dxa" w:w="1625"/>
+          </w:tcPr>
+          <w:p>
+            <w:r/>
+            <w:r>
+              <w:rPr>
+                <w:b w:val="0"/>
+              </w:rPr>
+              <w:t>CatBoostRegressor</w:t>
+            </w:r>
+          </w:p>
+        </w:tc>
+        <w:tc>
+          <w:tcPr>
+            <w:tcW w:type="dxa" w:w="1625"/>
+          </w:tcPr>
+          <w:p>
+            <w:r/>
+            <w:r>
+              <w:rPr>
+                <w:b w:val="0"/>
+              </w:rPr>
+              <w:t>direct</w:t>
+            </w:r>
+          </w:p>
+        </w:tc>
+        <w:tc>
+          <w:tcPr>
+            <w:tcW w:type="dxa" w:w="1625"/>
+          </w:tcPr>
+          <w:p>
+            <w:r/>
+            <w:r>
+              <w:rPr>
+                <w:b w:val="0"/>
+              </w:rPr>
+              <w:t>0.608393</w:t>
+            </w:r>
+          </w:p>
+        </w:tc>
+        <w:tc>
+          <w:tcPr>
+            <w:tcW w:type="dxa" w:w="1625"/>
+          </w:tcPr>
+          <w:p>
+            <w:r/>
+            <w:r>
+              <w:rPr>
+                <w:b w:val="0"/>
+              </w:rPr>
+              <w:t>1.376771</w:t>
+            </w:r>
+          </w:p>
+        </w:tc>
+        <w:tc>
+          <w:tcPr>
+            <w:tcW w:type="dxa" w:w="1625"/>
+          </w:tcPr>
+          <w:p>
+            <w:r/>
+            <w:r>
+              <w:rPr>
+                <w:b w:val="0"/>
+              </w:rPr>
+              <w:t>321.270479</w:t>
+            </w:r>
+          </w:p>
+        </w:tc>
+      </w:tr>
+      <w:tr>
+        <w:tc>
+          <w:tcPr>
+            <w:tcW w:type="dxa" w:w="1625"/>
+          </w:tcPr>
+          <w:p>
+            <w:r/>
+            <w:r>
+              <w:rPr>
+                <w:b w:val="0"/>
+              </w:rPr>
+              <w:t>M3b_catboost_direct_history_industry</w:t>
+            </w:r>
+          </w:p>
+        </w:tc>
+        <w:tc>
+          <w:tcPr>
+            <w:tcW w:type="dxa" w:w="1625"/>
+          </w:tcPr>
+          <w:p>
+            <w:r/>
+            <w:r>
+              <w:rPr>
+                <w:b w:val="0"/>
+              </w:rPr>
+              <w:t>CatBoostRegressor</w:t>
+            </w:r>
+          </w:p>
+        </w:tc>
+        <w:tc>
+          <w:tcPr>
+            <w:tcW w:type="dxa" w:w="1625"/>
+          </w:tcPr>
+          <w:p>
+            <w:r/>
+            <w:r>
+              <w:rPr>
+                <w:b w:val="0"/>
+              </w:rPr>
+              <w:t>direct</w:t>
+            </w:r>
+          </w:p>
+        </w:tc>
+        <w:tc>
+          <w:tcPr>
+            <w:tcW w:type="dxa" w:w="1625"/>
+          </w:tcPr>
+          <w:p>
+            <w:r/>
+            <w:r>
+              <w:rPr>
+                <w:b w:val="0"/>
+              </w:rPr>
+              <w:t>0.569533</w:t>
+            </w:r>
+          </w:p>
+        </w:tc>
+        <w:tc>
+          <w:tcPr>
+            <w:tcW w:type="dxa" w:w="1625"/>
+          </w:tcPr>
+          <w:p>
+            <w:r/>
+            <w:r>
+              <w:rPr>
+                <w:b w:val="0"/>
+              </w:rPr>
+              <w:t>2.182457</w:t>
+            </w:r>
+          </w:p>
+        </w:tc>
+        <w:tc>
+          <w:tcPr>
+            <w:tcW w:type="dxa" w:w="1625"/>
+          </w:tcPr>
+          <w:p>
+            <w:r/>
+            <w:r>
+              <w:rPr>
+                <w:b w:val="0"/>
+              </w:rPr>
+              <w:t>320.917106</w:t>
+            </w:r>
+          </w:p>
+        </w:tc>
+      </w:tr>
+      <w:tr>
+        <w:tc>
+          <w:tcPr>
+            <w:tcW w:type="dxa" w:w="1625"/>
+          </w:tcPr>
+          <w:p>
+            <w:r/>
+            <w:r>
+              <w:rPr>
+                <w:b w:val="0"/>
+              </w:rPr>
+              <w:t>M3a_catboost_direct_history_raw</w:t>
+            </w:r>
+          </w:p>
+        </w:tc>
+        <w:tc>
+          <w:tcPr>
+            <w:tcW w:type="dxa" w:w="1625"/>
+          </w:tcPr>
+          <w:p>
+            <w:r/>
+            <w:r>
+              <w:rPr>
+                <w:b w:val="0"/>
+              </w:rPr>
+              <w:t>CatBoostRegressor</w:t>
+            </w:r>
+          </w:p>
+        </w:tc>
+        <w:tc>
+          <w:tcPr>
+            <w:tcW w:type="dxa" w:w="1625"/>
+          </w:tcPr>
+          <w:p>
+            <w:r/>
+            <w:r>
+              <w:rPr>
+                <w:b w:val="0"/>
+              </w:rPr>
+              <w:t>direct</w:t>
+            </w:r>
+          </w:p>
+        </w:tc>
+        <w:tc>
+          <w:tcPr>
+            <w:tcW w:type="dxa" w:w="1625"/>
+          </w:tcPr>
+          <w:p>
+            <w:r/>
+            <w:r>
+              <w:rPr>
+                <w:b w:val="0"/>
+              </w:rPr>
+              <w:t>0.554307</w:t>
+            </w:r>
+          </w:p>
+        </w:tc>
+        <w:tc>
+          <w:tcPr>
+            <w:tcW w:type="dxa" w:w="1625"/>
+          </w:tcPr>
+          <w:p>
+            <w:r/>
+            <w:r>
+              <w:rPr>
+                <w:b w:val="0"/>
+              </w:rPr>
+              <w:t>0.700440</w:t>
+            </w:r>
+          </w:p>
+        </w:tc>
+        <w:tc>
+          <w:tcPr>
+            <w:tcW w:type="dxa" w:w="1625"/>
+          </w:tcPr>
+          <w:p>
+            <w:r/>
+            <w:r>
+              <w:rPr>
+                <w:b w:val="0"/>
+              </w:rPr>
+              <w:t>56.118523</w:t>
             </w:r>
           </w:p>
         </w:tc>
@@ -3225,7 +3483,7 @@
               <w:rPr>
                 <w:b w:val="0"/>
               </w:rPr>
-              <w:t>B4,M3,M4</w:t>
+              <w:t>B4,M3d,M4</w:t>
             </w:r>
           </w:p>
         </w:tc>
@@ -3325,7 +3583,7 @@
               <w:rPr>
                 <w:b w:val="0"/>
               </w:rPr>
-              <w:t>B4,M3,M4</w:t>
+              <w:t>B4,M3d,M4</w:t>
             </w:r>
           </w:p>
         </w:tc>
@@ -3425,7 +3683,7 @@
               <w:rPr>
                 <w:b w:val="0"/>
               </w:rPr>
-              <w:t>B4,M3,M4</w:t>
+              <w:t>B4,M3d,M4</w:t>
             </w:r>
           </w:p>
         </w:tc>
@@ -3525,7 +3783,7 @@
               <w:rPr>
                 <w:b w:val="0"/>
               </w:rPr>
-              <w:t>B4,M3,M4</w:t>
+              <w:t>B4,M3d,M4</w:t>
             </w:r>
           </w:p>
         </w:tc>
@@ -3625,7 +3883,7 @@
               <w:rPr>
                 <w:b w:val="0"/>
               </w:rPr>
-              <w:t>B4,M3,M4</w:t>
+              <w:t>B4,M3d,M4</w:t>
             </w:r>
           </w:p>
         </w:tc>
@@ -3725,7 +3983,7 @@
               <w:rPr>
                 <w:b w:val="0"/>
               </w:rPr>
-              <w:t>B4,M3,M4</w:t>
+              <w:t>B4,M3d,M4</w:t>
             </w:r>
           </w:p>
         </w:tc>
@@ -3825,7 +4083,7 @@
               <w:rPr>
                 <w:b w:val="0"/>
               </w:rPr>
-              <w:t>B4,M3,M4</w:t>
+              <w:t>B4,M3d,M4</w:t>
             </w:r>
           </w:p>
         </w:tc>
@@ -3925,7 +4183,7 @@
               <w:rPr>
                 <w:b w:val="0"/>
               </w:rPr>
-              <w:t>B4,M3,M4</w:t>
+              <w:t>B4,M3d,M4</w:t>
             </w:r>
           </w:p>
         </w:tc>
@@ -4025,7 +4283,7 @@
               <w:rPr>
                 <w:b w:val="0"/>
               </w:rPr>
-              <w:t>B4,M3,M4</w:t>
+              <w:t>B4,M3d,M4</w:t>
             </w:r>
           </w:p>
         </w:tc>
@@ -5280,7 +5538,7 @@
       <w:r>
         <w:drawing>
           <wp:inline xmlns:a="http://schemas.openxmlformats.org/drawingml/2006/main" xmlns:pic="http://schemas.openxmlformats.org/drawingml/2006/picture">
-            <wp:extent cx="5760720" cy="2170058"/>
+            <wp:extent cx="5760720" cy="2969673"/>
             <wp:docPr id="10" name="Picture 10"/>
             <wp:cNvGraphicFramePr>
               <a:graphicFrameLocks noChangeAspect="1"/>
@@ -5301,7 +5559,7 @@
                   <pic:spPr>
                     <a:xfrm>
                       <a:off x="0" y="0"/>
-                      <a:ext cx="5760720" cy="2170058"/>
+                      <a:ext cx="5760720" cy="2969673"/>
                     </a:xfrm>
                     <a:prstGeom prst="rect"/>
                   </pic:spPr>

</xml_diff>

<commit_message>
chore: finalize upload package
</commit_message>
<xml_diff>
--- a/deliverables/financial_performance_prediction_report.docx
+++ b/deliverables/financial_performance_prediction_report.docx
@@ -432,7 +432,7 @@
                 <w:color w:val="222222"/>
                 <w:sz w:val="19"/>
               </w:rPr>
-              <w:t>0.8572</w:t>
+              <w:t>0.8491</w:t>
             </w:r>
           </w:p>
         </w:tc>
@@ -554,7 +554,7 @@
                 <w:color w:val="222222"/>
                 <w:sz w:val="19"/>
               </w:rPr>
-              <w:t>Conda QuantEnv；Python 3.10.20</w:t>
+              <w:t>Conda QuantEnv；3.10.20</w:t>
             </w:r>
           </w:p>
         </w:tc>
@@ -737,7 +737,7 @@
           <w:color w:val="222222"/>
           <w:sz w:val="21"/>
         </w:rPr>
-        <w:t>最终模型为 M6 逐目标 OOF 融合，OOF 平均 R² 为 0.8572，分折均值标准差为 0.0490。</w:t>
+        <w:t>最终模型为 M6 逐目标 OOF 融合，OOF 平均 R² 为 0.8491，分折均值标准差为 0.0741。</w:t>
       </w:r>
     </w:p>
     <w:p>
@@ -769,7 +769,7 @@
           <w:color w:val="222222"/>
           <w:sz w:val="21"/>
         </w:rPr>
-        <w:t>CatBoost 直接预测的边际收益主要来自元数据，M3a/M3b/M3c/M3d 的 OOF 平均 R² 分别为 0.5543、0.5695、0.6084 和 0.6090；人工序列特征对直接模型的增益有限。</w:t>
+        <w:t>CatBoost 直接预测的边际收益主要来自元数据，M3a/M3b/M3c/M3d 的 OOF 平均 R² 分别为 0.6067、0.6130、0.6084 和 0.6147；人工序列特征对直接模型的增益有限。</w:t>
       </w:r>
     </w:p>
     <w:p>
@@ -785,7 +785,7 @@
           <w:color w:val="222222"/>
           <w:sz w:val="21"/>
         </w:rPr>
-        <w:t>残差模型是核心改进。M4 在 B4 基线残差上训练，OOF 平均 R² 达到 0.8253，说明模型更擅长学习偏离历史惯性的部分，而不是直接重建公司规模。</w:t>
+        <w:t>残差模型是核心改进。M4 在 B4 基线残差上训练，OOF 平均 R² 达到 0.8376，说明模型更擅长学习偏离历史惯性的部分，而不是直接重建公司规模。</w:t>
       </w:r>
     </w:p>
     <w:p>
@@ -817,7 +817,7 @@
           <w:color w:val="222222"/>
           <w:sz w:val="21"/>
         </w:rPr>
-        <w:t>最困难目标是股东权益，M6 OOF R² 为 0.4009；毛利、收入、营业费用和 EBITDA 等经营类目标均超过 0.96。</w:t>
+        <w:t>最困难目标是股东权益，M6 OOF R² 为 0.3073；毛利、营业收入、营业费用、EBITDA 等经营类目标均超过 0.96。</w:t>
       </w:r>
     </w:p>
     <w:p>
@@ -1027,7 +1027,7 @@
                 <w:color w:val="222222"/>
                 <w:sz w:val="19"/>
               </w:rPr>
-              <w:t>0.8572</w:t>
+              <w:t>0.8491</w:t>
             </w:r>
           </w:p>
         </w:tc>
@@ -1149,7 +1149,7 @@
                 <w:color w:val="222222"/>
                 <w:sz w:val="19"/>
               </w:rPr>
-              <w:t>M4 残差模型，OOF 平均 R² 0.8253</w:t>
+              <w:t>M4 残差模型，OOF 平均 R² 0.8376</w:t>
             </w:r>
           </w:p>
         </w:tc>
@@ -1271,7 +1271,7 @@
                 <w:color w:val="222222"/>
                 <w:sz w:val="19"/>
               </w:rPr>
-              <w:t>406 行 × 10 列；SHA256 c8c777fb68ca7d36...</w:t>
+              <w:t>406 行 × 10 列；SHA256 a488f55ba7c5254e...</w:t>
             </w:r>
           </w:p>
         </w:tc>
@@ -2615,187 +2615,6 @@
                 <w:sz w:val="17"/>
               </w:rPr>
               <w:t>874682cab231f9e4</w:t>
-            </w:r>
-          </w:p>
-        </w:tc>
-      </w:tr>
-      <w:tr>
-        <w:tc>
-          <w:tcPr>
-            <w:tcW w:type="dxa" w:w="3043"/>
-            <w:shd w:fill="F7F9FC"/>
-            <w:vAlign w:val="center"/>
-            <w:tcMar>
-              <w:top w:w="70" w:type="dxa"/>
-              <w:bottom w:w="70" w:type="dxa"/>
-              <w:left w:w="70" w:type="dxa"/>
-              <w:right w:w="70" w:type="dxa"/>
-            </w:tcMar>
-          </w:tcPr>
-          <w:p>
-            <w:pPr>
-              <w:spacing w:after="0"/>
-              <w:jc w:val="left"/>
-            </w:pPr>
-            <w:r/>
-            <w:r>
-              <w:rPr>
-                <w:rFonts w:ascii="Times New Roman" w:hAnsi="Times New Roman" w:eastAsia="宋体"/>
-                <w:b w:val="0"/>
-                <w:i w:val="0"/>
-                <w:color w:val="222222"/>
-                <w:sz w:val="17"/>
-              </w:rPr>
-              <w:t>data_dictionary.txt</w:t>
-            </w:r>
-          </w:p>
-        </w:tc>
-        <w:tc>
-          <w:tcPr>
-            <w:tcW w:type="dxa" w:w="3043"/>
-            <w:shd w:fill="F7F9FC"/>
-            <w:vAlign w:val="center"/>
-            <w:tcMar>
-              <w:top w:w="70" w:type="dxa"/>
-              <w:bottom w:w="70" w:type="dxa"/>
-              <w:left w:w="70" w:type="dxa"/>
-              <w:right w:w="70" w:type="dxa"/>
-            </w:tcMar>
-          </w:tcPr>
-          <w:p>
-            <w:pPr>
-              <w:spacing w:after="0"/>
-              <w:jc w:val="center"/>
-            </w:pPr>
-            <w:r/>
-            <w:r>
-              <w:rPr>
-                <w:rFonts w:ascii="Times New Roman" w:hAnsi="Times New Roman" w:eastAsia="宋体"/>
-                <w:b w:val="0"/>
-                <w:i w:val="0"/>
-                <w:color w:val="222222"/>
-                <w:sz w:val="17"/>
-              </w:rPr>
-              <w:t>0.01</w:t>
-            </w:r>
-          </w:p>
-        </w:tc>
-        <w:tc>
-          <w:tcPr>
-            <w:tcW w:type="dxa" w:w="3043"/>
-            <w:shd w:fill="F7F9FC"/>
-            <w:vAlign w:val="center"/>
-            <w:tcMar>
-              <w:top w:w="70" w:type="dxa"/>
-              <w:bottom w:w="70" w:type="dxa"/>
-              <w:left w:w="70" w:type="dxa"/>
-              <w:right w:w="70" w:type="dxa"/>
-            </w:tcMar>
-          </w:tcPr>
-          <w:p>
-            <w:pPr>
-              <w:spacing w:after="0"/>
-              <w:jc w:val="center"/>
-            </w:pPr>
-            <w:r/>
-            <w:r>
-              <w:rPr>
-                <w:rFonts w:ascii="Times New Roman" w:hAnsi="Times New Roman" w:eastAsia="宋体"/>
-                <w:b w:val="0"/>
-                <w:i w:val="0"/>
-                <w:color w:val="222222"/>
-                <w:sz w:val="17"/>
-              </w:rPr>
-              <w:t>ba3697c21555558b</w:t>
-            </w:r>
-          </w:p>
-        </w:tc>
-      </w:tr>
-      <w:tr>
-        <w:tc>
-          <w:tcPr>
-            <w:tcW w:type="dxa" w:w="3043"/>
-            <w:vAlign w:val="center"/>
-            <w:tcMar>
-              <w:top w:w="70" w:type="dxa"/>
-              <w:bottom w:w="70" w:type="dxa"/>
-              <w:left w:w="70" w:type="dxa"/>
-              <w:right w:w="70" w:type="dxa"/>
-            </w:tcMar>
-          </w:tcPr>
-          <w:p>
-            <w:pPr>
-              <w:spacing w:after="0"/>
-              <w:jc w:val="left"/>
-            </w:pPr>
-            <w:r/>
-            <w:r>
-              <w:rPr>
-                <w:rFonts w:ascii="Times New Roman" w:hAnsi="Times New Roman" w:eastAsia="宋体"/>
-                <w:b w:val="0"/>
-                <w:i w:val="0"/>
-                <w:color w:val="222222"/>
-                <w:sz w:val="17"/>
-              </w:rPr>
-              <w:t>说明.docx</w:t>
-            </w:r>
-          </w:p>
-        </w:tc>
-        <w:tc>
-          <w:tcPr>
-            <w:tcW w:type="dxa" w:w="3043"/>
-            <w:vAlign w:val="center"/>
-            <w:tcMar>
-              <w:top w:w="70" w:type="dxa"/>
-              <w:bottom w:w="70" w:type="dxa"/>
-              <w:left w:w="70" w:type="dxa"/>
-              <w:right w:w="70" w:type="dxa"/>
-            </w:tcMar>
-          </w:tcPr>
-          <w:p>
-            <w:pPr>
-              <w:spacing w:after="0"/>
-              <w:jc w:val="center"/>
-            </w:pPr>
-            <w:r/>
-            <w:r>
-              <w:rPr>
-                <w:rFonts w:ascii="Times New Roman" w:hAnsi="Times New Roman" w:eastAsia="宋体"/>
-                <w:b w:val="0"/>
-                <w:i w:val="0"/>
-                <w:color w:val="222222"/>
-                <w:sz w:val="17"/>
-              </w:rPr>
-              <w:t>0.02</w:t>
-            </w:r>
-          </w:p>
-        </w:tc>
-        <w:tc>
-          <w:tcPr>
-            <w:tcW w:type="dxa" w:w="3043"/>
-            <w:vAlign w:val="center"/>
-            <w:tcMar>
-              <w:top w:w="70" w:type="dxa"/>
-              <w:bottom w:w="70" w:type="dxa"/>
-              <w:left w:w="70" w:type="dxa"/>
-              <w:right w:w="70" w:type="dxa"/>
-            </w:tcMar>
-          </w:tcPr>
-          <w:p>
-            <w:pPr>
-              <w:spacing w:after="0"/>
-              <w:jc w:val="center"/>
-            </w:pPr>
-            <w:r/>
-            <w:r>
-              <w:rPr>
-                <w:rFonts w:ascii="Times New Roman" w:hAnsi="Times New Roman" w:eastAsia="宋体"/>
-                <w:b w:val="0"/>
-                <w:i w:val="0"/>
-                <w:color w:val="222222"/>
-                <w:sz w:val="17"/>
-              </w:rPr>
-              <w:t>c4e71f313214b7fe</w:t>
             </w:r>
           </w:p>
         </w:tc>
@@ -5647,7 +5466,7 @@
       <w:r>
         <w:drawing>
           <wp:inline xmlns:a="http://schemas.openxmlformats.org/drawingml/2006/main" xmlns:pic="http://schemas.openxmlformats.org/drawingml/2006/picture">
-            <wp:extent cx="5472000" cy="2510785"/>
+            <wp:extent cx="5472000" cy="2529076"/>
             <wp:docPr id="6" name="Picture 6"/>
             <wp:cNvGraphicFramePr>
               <a:graphicFrameLocks noChangeAspect="1"/>
@@ -5668,7 +5487,7 @@
                   <pic:spPr>
                     <a:xfrm>
                       <a:off x="0" y="0"/>
-                      <a:ext cx="5472000" cy="2510785"/>
+                      <a:ext cx="5472000" cy="2529076"/>
                     </a:xfrm>
                     <a:prstGeom prst="rect"/>
                   </pic:spPr>
@@ -5823,7 +5642,7 @@
       <w:r>
         <w:drawing>
           <wp:inline xmlns:a="http://schemas.openxmlformats.org/drawingml/2006/main" xmlns:pic="http://schemas.openxmlformats.org/drawingml/2006/picture">
-            <wp:extent cx="5472000" cy="4541472"/>
+            <wp:extent cx="5472000" cy="4963500"/>
             <wp:docPr id="8" name="Picture 8"/>
             <wp:cNvGraphicFramePr>
               <a:graphicFrameLocks noChangeAspect="1"/>
@@ -5844,7 +5663,7 @@
                   <pic:spPr>
                     <a:xfrm>
                       <a:off x="0" y="0"/>
-                      <a:ext cx="5472000" cy="4541472"/>
+                      <a:ext cx="5472000" cy="4963500"/>
                     </a:xfrm>
                     <a:prstGeom prst="rect"/>
                   </pic:spPr>
@@ -7692,7 +7511,7 @@
                 <w:color w:val="222222"/>
                 <w:sz w:val="16"/>
               </w:rPr>
-              <w:t>B0 均值预测</w:t>
+              <w:t>M6 逐目标 OOF 融合</w:t>
             </w:r>
           </w:p>
         </w:tc>
@@ -7721,7 +7540,7 @@
                 <w:color w:val="222222"/>
                 <w:sz w:val="16"/>
               </w:rPr>
-              <w:t>指标校验</w:t>
+              <w:t>最终模型</w:t>
             </w:r>
           </w:p>
         </w:tc>
@@ -7750,7 +7569,7 @@
                 <w:color w:val="222222"/>
                 <w:sz w:val="16"/>
               </w:rPr>
-              <w:t>-0.0012</w:t>
+              <w:t>0.8491</w:t>
             </w:r>
           </w:p>
         </w:tc>
@@ -7779,7 +7598,247 @@
                 <w:color w:val="222222"/>
                 <w:sz w:val="16"/>
               </w:rPr>
-              <w:t>0.0040</w:t>
+              <w:t>0.0741</w:t>
+            </w:r>
+          </w:p>
+        </w:tc>
+      </w:tr>
+      <w:tr>
+        <w:tc>
+          <w:tcPr>
+            <w:tcW w:type="dxa" w:w="2282"/>
+            <w:shd w:fill="F7F9FC"/>
+            <w:vAlign w:val="center"/>
+            <w:tcMar>
+              <w:top w:w="70" w:type="dxa"/>
+              <w:bottom w:w="70" w:type="dxa"/>
+              <w:left w:w="70" w:type="dxa"/>
+              <w:right w:w="70" w:type="dxa"/>
+            </w:tcMar>
+          </w:tcPr>
+          <w:p>
+            <w:pPr>
+              <w:spacing w:after="0"/>
+              <w:jc w:val="left"/>
+            </w:pPr>
+            <w:r/>
+            <w:r>
+              <w:rPr>
+                <w:rFonts w:ascii="Times New Roman" w:hAnsi="Times New Roman" w:eastAsia="宋体"/>
+                <w:b w:val="0"/>
+                <w:i w:val="0"/>
+                <w:color w:val="222222"/>
+                <w:sz w:val="16"/>
+              </w:rPr>
+              <w:t>M4 CatBoost 残差</w:t>
+            </w:r>
+          </w:p>
+        </w:tc>
+        <w:tc>
+          <w:tcPr>
+            <w:tcW w:type="dxa" w:w="2282"/>
+            <w:shd w:fill="F7F9FC"/>
+            <w:vAlign w:val="center"/>
+            <w:tcMar>
+              <w:top w:w="70" w:type="dxa"/>
+              <w:bottom w:w="70" w:type="dxa"/>
+              <w:left w:w="70" w:type="dxa"/>
+              <w:right w:w="70" w:type="dxa"/>
+            </w:tcMar>
+          </w:tcPr>
+          <w:p>
+            <w:pPr>
+              <w:spacing w:after="0"/>
+              <w:jc w:val="center"/>
+            </w:pPr>
+            <w:r/>
+            <w:r>
+              <w:rPr>
+                <w:rFonts w:ascii="Times New Roman" w:hAnsi="Times New Roman" w:eastAsia="宋体"/>
+                <w:b w:val="0"/>
+                <w:i w:val="0"/>
+                <w:color w:val="222222"/>
+                <w:sz w:val="16"/>
+              </w:rPr>
+              <w:t>残差主模型</w:t>
+            </w:r>
+          </w:p>
+        </w:tc>
+        <w:tc>
+          <w:tcPr>
+            <w:tcW w:type="dxa" w:w="2282"/>
+            <w:shd w:fill="F7F9FC"/>
+            <w:vAlign w:val="center"/>
+            <w:tcMar>
+              <w:top w:w="70" w:type="dxa"/>
+              <w:bottom w:w="70" w:type="dxa"/>
+              <w:left w:w="70" w:type="dxa"/>
+              <w:right w:w="70" w:type="dxa"/>
+            </w:tcMar>
+          </w:tcPr>
+          <w:p>
+            <w:pPr>
+              <w:spacing w:after="0"/>
+              <w:jc w:val="center"/>
+            </w:pPr>
+            <w:r/>
+            <w:r>
+              <w:rPr>
+                <w:rFonts w:ascii="Times New Roman" w:hAnsi="Times New Roman" w:eastAsia="宋体"/>
+                <w:b w:val="0"/>
+                <w:i w:val="0"/>
+                <w:color w:val="222222"/>
+                <w:sz w:val="16"/>
+              </w:rPr>
+              <w:t>0.8376</w:t>
+            </w:r>
+          </w:p>
+        </w:tc>
+        <w:tc>
+          <w:tcPr>
+            <w:tcW w:type="dxa" w:w="2282"/>
+            <w:shd w:fill="F7F9FC"/>
+            <w:vAlign w:val="center"/>
+            <w:tcMar>
+              <w:top w:w="70" w:type="dxa"/>
+              <w:bottom w:w="70" w:type="dxa"/>
+              <w:left w:w="70" w:type="dxa"/>
+              <w:right w:w="70" w:type="dxa"/>
+            </w:tcMar>
+          </w:tcPr>
+          <w:p>
+            <w:pPr>
+              <w:spacing w:after="0"/>
+              <w:jc w:val="center"/>
+            </w:pPr>
+            <w:r/>
+            <w:r>
+              <w:rPr>
+                <w:rFonts w:ascii="Times New Roman" w:hAnsi="Times New Roman" w:eastAsia="宋体"/>
+                <w:b w:val="0"/>
+                <w:i w:val="0"/>
+                <w:color w:val="222222"/>
+                <w:sz w:val="16"/>
+              </w:rPr>
+              <w:t>0.0904</w:t>
+            </w:r>
+          </w:p>
+        </w:tc>
+      </w:tr>
+      <w:tr>
+        <w:tc>
+          <w:tcPr>
+            <w:tcW w:type="dxa" w:w="2282"/>
+            <w:vAlign w:val="center"/>
+            <w:tcMar>
+              <w:top w:w="70" w:type="dxa"/>
+              <w:bottom w:w="70" w:type="dxa"/>
+              <w:left w:w="70" w:type="dxa"/>
+              <w:right w:w="70" w:type="dxa"/>
+            </w:tcMar>
+          </w:tcPr>
+          <w:p>
+            <w:pPr>
+              <w:spacing w:after="0"/>
+              <w:jc w:val="left"/>
+            </w:pPr>
+            <w:r/>
+            <w:r>
+              <w:rPr>
+                <w:rFonts w:ascii="Times New Roman" w:hAnsi="Times New Roman" w:eastAsia="宋体"/>
+                <w:b w:val="0"/>
+                <w:i w:val="0"/>
+                <w:color w:val="222222"/>
+                <w:sz w:val="16"/>
+              </w:rPr>
+              <w:t>B4 规则基线融合</w:t>
+            </w:r>
+          </w:p>
+        </w:tc>
+        <w:tc>
+          <w:tcPr>
+            <w:tcW w:type="dxa" w:w="2282"/>
+            <w:vAlign w:val="center"/>
+            <w:tcMar>
+              <w:top w:w="70" w:type="dxa"/>
+              <w:bottom w:w="70" w:type="dxa"/>
+              <w:left w:w="70" w:type="dxa"/>
+              <w:right w:w="70" w:type="dxa"/>
+            </w:tcMar>
+          </w:tcPr>
+          <w:p>
+            <w:pPr>
+              <w:spacing w:after="0"/>
+              <w:jc w:val="center"/>
+            </w:pPr>
+            <w:r/>
+            <w:r>
+              <w:rPr>
+                <w:rFonts w:ascii="Times New Roman" w:hAnsi="Times New Roman" w:eastAsia="宋体"/>
+                <w:b w:val="0"/>
+                <w:i w:val="0"/>
+                <w:color w:val="222222"/>
+                <w:sz w:val="16"/>
+              </w:rPr>
+              <w:t>规则基线</w:t>
+            </w:r>
+          </w:p>
+        </w:tc>
+        <w:tc>
+          <w:tcPr>
+            <w:tcW w:type="dxa" w:w="2282"/>
+            <w:vAlign w:val="center"/>
+            <w:tcMar>
+              <w:top w:w="70" w:type="dxa"/>
+              <w:bottom w:w="70" w:type="dxa"/>
+              <w:left w:w="70" w:type="dxa"/>
+              <w:right w:w="70" w:type="dxa"/>
+            </w:tcMar>
+          </w:tcPr>
+          <w:p>
+            <w:pPr>
+              <w:spacing w:after="0"/>
+              <w:jc w:val="center"/>
+            </w:pPr>
+            <w:r/>
+            <w:r>
+              <w:rPr>
+                <w:rFonts w:ascii="Times New Roman" w:hAnsi="Times New Roman" w:eastAsia="宋体"/>
+                <w:b w:val="0"/>
+                <w:i w:val="0"/>
+                <w:color w:val="222222"/>
+                <w:sz w:val="16"/>
+              </w:rPr>
+              <w:t>0.7831</w:t>
+            </w:r>
+          </w:p>
+        </w:tc>
+        <w:tc>
+          <w:tcPr>
+            <w:tcW w:type="dxa" w:w="2282"/>
+            <w:vAlign w:val="center"/>
+            <w:tcMar>
+              <w:top w:w="70" w:type="dxa"/>
+              <w:bottom w:w="70" w:type="dxa"/>
+              <w:left w:w="70" w:type="dxa"/>
+              <w:right w:w="70" w:type="dxa"/>
+            </w:tcMar>
+          </w:tcPr>
+          <w:p>
+            <w:pPr>
+              <w:spacing w:after="0"/>
+              <w:jc w:val="center"/>
+            </w:pPr>
+            <w:r/>
+            <w:r>
+              <w:rPr>
+                <w:rFonts w:ascii="Times New Roman" w:hAnsi="Times New Roman" w:eastAsia="宋体"/>
+                <w:b w:val="0"/>
+                <w:i w:val="0"/>
+                <w:color w:val="222222"/>
+                <w:sz w:val="16"/>
+              </w:rPr>
+              <w:t>0.1291</w:t>
             </w:r>
           </w:p>
         </w:tc>
@@ -7932,365 +7991,6 @@
                 <w:color w:val="222222"/>
                 <w:sz w:val="16"/>
               </w:rPr>
-              <w:t>B2 季节性复制</w:t>
-            </w:r>
-          </w:p>
-        </w:tc>
-        <w:tc>
-          <w:tcPr>
-            <w:tcW w:type="dxa" w:w="2282"/>
-            <w:vAlign w:val="center"/>
-            <w:tcMar>
-              <w:top w:w="70" w:type="dxa"/>
-              <w:bottom w:w="70" w:type="dxa"/>
-              <w:left w:w="70" w:type="dxa"/>
-              <w:right w:w="70" w:type="dxa"/>
-            </w:tcMar>
-          </w:tcPr>
-          <w:p>
-            <w:pPr>
-              <w:spacing w:after="0"/>
-              <w:jc w:val="center"/>
-            </w:pPr>
-            <w:r/>
-            <w:r>
-              <w:rPr>
-                <w:rFonts w:ascii="Times New Roman" w:hAnsi="Times New Roman" w:eastAsia="宋体"/>
-                <w:b w:val="0"/>
-                <w:i w:val="0"/>
-                <w:color w:val="222222"/>
-                <w:sz w:val="16"/>
-              </w:rPr>
-              <w:t>季节性规则</w:t>
-            </w:r>
-          </w:p>
-        </w:tc>
-        <w:tc>
-          <w:tcPr>
-            <w:tcW w:type="dxa" w:w="2282"/>
-            <w:vAlign w:val="center"/>
-            <w:tcMar>
-              <w:top w:w="70" w:type="dxa"/>
-              <w:bottom w:w="70" w:type="dxa"/>
-              <w:left w:w="70" w:type="dxa"/>
-              <w:right w:w="70" w:type="dxa"/>
-            </w:tcMar>
-          </w:tcPr>
-          <w:p>
-            <w:pPr>
-              <w:spacing w:after="0"/>
-              <w:jc w:val="center"/>
-            </w:pPr>
-            <w:r/>
-            <w:r>
-              <w:rPr>
-                <w:rFonts w:ascii="Times New Roman" w:hAnsi="Times New Roman" w:eastAsia="宋体"/>
-                <w:b w:val="0"/>
-                <w:i w:val="0"/>
-                <w:color w:val="222222"/>
-                <w:sz w:val="16"/>
-              </w:rPr>
-              <w:t>0.3315</w:t>
-            </w:r>
-          </w:p>
-        </w:tc>
-        <w:tc>
-          <w:tcPr>
-            <w:tcW w:type="dxa" w:w="2282"/>
-            <w:vAlign w:val="center"/>
-            <w:tcMar>
-              <w:top w:w="70" w:type="dxa"/>
-              <w:bottom w:w="70" w:type="dxa"/>
-              <w:left w:w="70" w:type="dxa"/>
-              <w:right w:w="70" w:type="dxa"/>
-            </w:tcMar>
-          </w:tcPr>
-          <w:p>
-            <w:pPr>
-              <w:spacing w:after="0"/>
-              <w:jc w:val="center"/>
-            </w:pPr>
-            <w:r/>
-            <w:r>
-              <w:rPr>
-                <w:rFonts w:ascii="Times New Roman" w:hAnsi="Times New Roman" w:eastAsia="宋体"/>
-                <w:b w:val="0"/>
-                <w:i w:val="0"/>
-                <w:color w:val="222222"/>
-                <w:sz w:val="16"/>
-              </w:rPr>
-              <w:t>0.4688</w:t>
-            </w:r>
-          </w:p>
-        </w:tc>
-      </w:tr>
-      <w:tr>
-        <w:tc>
-          <w:tcPr>
-            <w:tcW w:type="dxa" w:w="2282"/>
-            <w:shd w:fill="F7F9FC"/>
-            <w:vAlign w:val="center"/>
-            <w:tcMar>
-              <w:top w:w="70" w:type="dxa"/>
-              <w:bottom w:w="70" w:type="dxa"/>
-              <w:left w:w="70" w:type="dxa"/>
-              <w:right w:w="70" w:type="dxa"/>
-            </w:tcMar>
-          </w:tcPr>
-          <w:p>
-            <w:pPr>
-              <w:spacing w:after="0"/>
-              <w:jc w:val="left"/>
-            </w:pPr>
-            <w:r/>
-            <w:r>
-              <w:rPr>
-                <w:rFonts w:ascii="Times New Roman" w:hAnsi="Times New Roman" w:eastAsia="宋体"/>
-                <w:b w:val="0"/>
-                <w:i w:val="0"/>
-                <w:color w:val="222222"/>
-                <w:sz w:val="16"/>
-              </w:rPr>
-              <w:t>B3 短趋势外推</w:t>
-            </w:r>
-          </w:p>
-        </w:tc>
-        <w:tc>
-          <w:tcPr>
-            <w:tcW w:type="dxa" w:w="2282"/>
-            <w:shd w:fill="F7F9FC"/>
-            <w:vAlign w:val="center"/>
-            <w:tcMar>
-              <w:top w:w="70" w:type="dxa"/>
-              <w:bottom w:w="70" w:type="dxa"/>
-              <w:left w:w="70" w:type="dxa"/>
-              <w:right w:w="70" w:type="dxa"/>
-            </w:tcMar>
-          </w:tcPr>
-          <w:p>
-            <w:pPr>
-              <w:spacing w:after="0"/>
-              <w:jc w:val="center"/>
-            </w:pPr>
-            <w:r/>
-            <w:r>
-              <w:rPr>
-                <w:rFonts w:ascii="Times New Roman" w:hAnsi="Times New Roman" w:eastAsia="宋体"/>
-                <w:b w:val="0"/>
-                <w:i w:val="0"/>
-                <w:color w:val="222222"/>
-                <w:sz w:val="16"/>
-              </w:rPr>
-              <w:t>趋势规则</w:t>
-            </w:r>
-          </w:p>
-        </w:tc>
-        <w:tc>
-          <w:tcPr>
-            <w:tcW w:type="dxa" w:w="2282"/>
-            <w:shd w:fill="F7F9FC"/>
-            <w:vAlign w:val="center"/>
-            <w:tcMar>
-              <w:top w:w="70" w:type="dxa"/>
-              <w:bottom w:w="70" w:type="dxa"/>
-              <w:left w:w="70" w:type="dxa"/>
-              <w:right w:w="70" w:type="dxa"/>
-            </w:tcMar>
-          </w:tcPr>
-          <w:p>
-            <w:pPr>
-              <w:spacing w:after="0"/>
-              <w:jc w:val="center"/>
-            </w:pPr>
-            <w:r/>
-            <w:r>
-              <w:rPr>
-                <w:rFonts w:ascii="Times New Roman" w:hAnsi="Times New Roman" w:eastAsia="宋体"/>
-                <w:b w:val="0"/>
-                <w:i w:val="0"/>
-                <w:color w:val="222222"/>
-                <w:sz w:val="16"/>
-              </w:rPr>
-              <w:t>0.5004</w:t>
-            </w:r>
-          </w:p>
-        </w:tc>
-        <w:tc>
-          <w:tcPr>
-            <w:tcW w:type="dxa" w:w="2282"/>
-            <w:shd w:fill="F7F9FC"/>
-            <w:vAlign w:val="center"/>
-            <w:tcMar>
-              <w:top w:w="70" w:type="dxa"/>
-              <w:bottom w:w="70" w:type="dxa"/>
-              <w:left w:w="70" w:type="dxa"/>
-              <w:right w:w="70" w:type="dxa"/>
-            </w:tcMar>
-          </w:tcPr>
-          <w:p>
-            <w:pPr>
-              <w:spacing w:after="0"/>
-              <w:jc w:val="center"/>
-            </w:pPr>
-            <w:r/>
-            <w:r>
-              <w:rPr>
-                <w:rFonts w:ascii="Times New Roman" w:hAnsi="Times New Roman" w:eastAsia="宋体"/>
-                <w:b w:val="0"/>
-                <w:i w:val="0"/>
-                <w:color w:val="222222"/>
-                <w:sz w:val="16"/>
-              </w:rPr>
-              <w:t>0.2116</w:t>
-            </w:r>
-          </w:p>
-        </w:tc>
-      </w:tr>
-      <w:tr>
-        <w:tc>
-          <w:tcPr>
-            <w:tcW w:type="dxa" w:w="2282"/>
-            <w:vAlign w:val="center"/>
-            <w:tcMar>
-              <w:top w:w="70" w:type="dxa"/>
-              <w:bottom w:w="70" w:type="dxa"/>
-              <w:left w:w="70" w:type="dxa"/>
-              <w:right w:w="70" w:type="dxa"/>
-            </w:tcMar>
-          </w:tcPr>
-          <w:p>
-            <w:pPr>
-              <w:spacing w:after="0"/>
-              <w:jc w:val="left"/>
-            </w:pPr>
-            <w:r/>
-            <w:r>
-              <w:rPr>
-                <w:rFonts w:ascii="Times New Roman" w:hAnsi="Times New Roman" w:eastAsia="宋体"/>
-                <w:b w:val="0"/>
-                <w:i w:val="0"/>
-                <w:color w:val="222222"/>
-                <w:sz w:val="16"/>
-              </w:rPr>
-              <w:t>B4 规则基线融合</w:t>
-            </w:r>
-          </w:p>
-        </w:tc>
-        <w:tc>
-          <w:tcPr>
-            <w:tcW w:type="dxa" w:w="2282"/>
-            <w:vAlign w:val="center"/>
-            <w:tcMar>
-              <w:top w:w="70" w:type="dxa"/>
-              <w:bottom w:w="70" w:type="dxa"/>
-              <w:left w:w="70" w:type="dxa"/>
-              <w:right w:w="70" w:type="dxa"/>
-            </w:tcMar>
-          </w:tcPr>
-          <w:p>
-            <w:pPr>
-              <w:spacing w:after="0"/>
-              <w:jc w:val="center"/>
-            </w:pPr>
-            <w:r/>
-            <w:r>
-              <w:rPr>
-                <w:rFonts w:ascii="Times New Roman" w:hAnsi="Times New Roman" w:eastAsia="宋体"/>
-                <w:b w:val="0"/>
-                <w:i w:val="0"/>
-                <w:color w:val="222222"/>
-                <w:sz w:val="16"/>
-              </w:rPr>
-              <w:t>规则基线</w:t>
-            </w:r>
-          </w:p>
-        </w:tc>
-        <w:tc>
-          <w:tcPr>
-            <w:tcW w:type="dxa" w:w="2282"/>
-            <w:vAlign w:val="center"/>
-            <w:tcMar>
-              <w:top w:w="70" w:type="dxa"/>
-              <w:bottom w:w="70" w:type="dxa"/>
-              <w:left w:w="70" w:type="dxa"/>
-              <w:right w:w="70" w:type="dxa"/>
-            </w:tcMar>
-          </w:tcPr>
-          <w:p>
-            <w:pPr>
-              <w:spacing w:after="0"/>
-              <w:jc w:val="center"/>
-            </w:pPr>
-            <w:r/>
-            <w:r>
-              <w:rPr>
-                <w:rFonts w:ascii="Times New Roman" w:hAnsi="Times New Roman" w:eastAsia="宋体"/>
-                <w:b w:val="0"/>
-                <w:i w:val="0"/>
-                <w:color w:val="222222"/>
-                <w:sz w:val="16"/>
-              </w:rPr>
-              <w:t>0.7831</w:t>
-            </w:r>
-          </w:p>
-        </w:tc>
-        <w:tc>
-          <w:tcPr>
-            <w:tcW w:type="dxa" w:w="2282"/>
-            <w:vAlign w:val="center"/>
-            <w:tcMar>
-              <w:top w:w="70" w:type="dxa"/>
-              <w:bottom w:w="70" w:type="dxa"/>
-              <w:left w:w="70" w:type="dxa"/>
-              <w:right w:w="70" w:type="dxa"/>
-            </w:tcMar>
-          </w:tcPr>
-          <w:p>
-            <w:pPr>
-              <w:spacing w:after="0"/>
-              <w:jc w:val="center"/>
-            </w:pPr>
-            <w:r/>
-            <w:r>
-              <w:rPr>
-                <w:rFonts w:ascii="Times New Roman" w:hAnsi="Times New Roman" w:eastAsia="宋体"/>
-                <w:b w:val="0"/>
-                <w:i w:val="0"/>
-                <w:color w:val="222222"/>
-                <w:sz w:val="16"/>
-              </w:rPr>
-              <w:t>0.1291</w:t>
-            </w:r>
-          </w:p>
-        </w:tc>
-      </w:tr>
-      <w:tr>
-        <w:tc>
-          <w:tcPr>
-            <w:tcW w:type="dxa" w:w="2282"/>
-            <w:shd w:fill="F7F9FC"/>
-            <w:vAlign w:val="center"/>
-            <w:tcMar>
-              <w:top w:w="70" w:type="dxa"/>
-              <w:bottom w:w="70" w:type="dxa"/>
-              <w:left w:w="70" w:type="dxa"/>
-              <w:right w:w="70" w:type="dxa"/>
-            </w:tcMar>
-          </w:tcPr>
-          <w:p>
-            <w:pPr>
-              <w:spacing w:after="0"/>
-              <w:jc w:val="left"/>
-            </w:pPr>
-            <w:r/>
-            <w:r>
-              <w:rPr>
-                <w:rFonts w:ascii="Times New Roman" w:hAnsi="Times New Roman" w:eastAsia="宋体"/>
-                <w:b w:val="0"/>
-                <w:i w:val="0"/>
-                <w:color w:val="222222"/>
-                <w:sz w:val="16"/>
-              </w:rPr>
               <w:t>M1 Ridge</w:t>
             </w:r>
           </w:p>
@@ -8298,7 +7998,6 @@
         <w:tc>
           <w:tcPr>
             <w:tcW w:type="dxa" w:w="2282"/>
-            <w:shd w:fill="F7F9FC"/>
             <w:vAlign w:val="center"/>
             <w:tcMar>
               <w:top w:w="70" w:type="dxa"/>
@@ -8328,7 +8027,6 @@
         <w:tc>
           <w:tcPr>
             <w:tcW w:type="dxa" w:w="2282"/>
-            <w:shd w:fill="F7F9FC"/>
             <w:vAlign w:val="center"/>
             <w:tcMar>
               <w:top w:w="70" w:type="dxa"/>
@@ -8351,68 +8049,7 @@
                 <w:color w:val="222222"/>
                 <w:sz w:val="16"/>
               </w:rPr>
-              <w:t>0.7314</w:t>
-            </w:r>
-          </w:p>
-        </w:tc>
-        <w:tc>
-          <w:tcPr>
-            <w:tcW w:type="dxa" w:w="2282"/>
-            <w:shd w:fill="F7F9FC"/>
-            <w:vAlign w:val="center"/>
-            <w:tcMar>
-              <w:top w:w="70" w:type="dxa"/>
-              <w:bottom w:w="70" w:type="dxa"/>
-              <w:left w:w="70" w:type="dxa"/>
-              <w:right w:w="70" w:type="dxa"/>
-            </w:tcMar>
-          </w:tcPr>
-          <w:p>
-            <w:pPr>
-              <w:spacing w:after="0"/>
-              <w:jc w:val="center"/>
-            </w:pPr>
-            <w:r/>
-            <w:r>
-              <w:rPr>
-                <w:rFonts w:ascii="Times New Roman" w:hAnsi="Times New Roman" w:eastAsia="宋体"/>
-                <w:b w:val="0"/>
-                <w:i w:val="0"/>
-                <w:color w:val="222222"/>
-                <w:sz w:val="16"/>
-              </w:rPr>
-              <w:t>0.1903</w:t>
-            </w:r>
-          </w:p>
-        </w:tc>
-      </w:tr>
-      <w:tr>
-        <w:tc>
-          <w:tcPr>
-            <w:tcW w:type="dxa" w:w="2282"/>
-            <w:vAlign w:val="center"/>
-            <w:tcMar>
-              <w:top w:w="70" w:type="dxa"/>
-              <w:bottom w:w="70" w:type="dxa"/>
-              <w:left w:w="70" w:type="dxa"/>
-              <w:right w:w="70" w:type="dxa"/>
-            </w:tcMar>
-          </w:tcPr>
-          <w:p>
-            <w:pPr>
-              <w:spacing w:after="0"/>
-              <w:jc w:val="left"/>
-            </w:pPr>
-            <w:r/>
-            <w:r>
-              <w:rPr>
-                <w:rFonts w:ascii="Times New Roman" w:hAnsi="Times New Roman" w:eastAsia="宋体"/>
-                <w:b w:val="0"/>
-                <w:i w:val="0"/>
-                <w:color w:val="222222"/>
-                <w:sz w:val="16"/>
-              </w:rPr>
-              <w:t>M2 HistGBR</w:t>
+              <w:t>0.7206</w:t>
             </w:r>
           </w:p>
         </w:tc>
@@ -8441,545 +8078,7 @@
                 <w:color w:val="222222"/>
                 <w:sz w:val="16"/>
               </w:rPr>
-              <w:t>非线性对照</w:t>
-            </w:r>
-          </w:p>
-        </w:tc>
-        <w:tc>
-          <w:tcPr>
-            <w:tcW w:type="dxa" w:w="2282"/>
-            <w:vAlign w:val="center"/>
-            <w:tcMar>
-              <w:top w:w="70" w:type="dxa"/>
-              <w:bottom w:w="70" w:type="dxa"/>
-              <w:left w:w="70" w:type="dxa"/>
-              <w:right w:w="70" w:type="dxa"/>
-            </w:tcMar>
-          </w:tcPr>
-          <w:p>
-            <w:pPr>
-              <w:spacing w:after="0"/>
-              <w:jc w:val="center"/>
-            </w:pPr>
-            <w:r/>
-            <w:r>
-              <w:rPr>
-                <w:rFonts w:ascii="Times New Roman" w:hAnsi="Times New Roman" w:eastAsia="宋体"/>
-                <w:b w:val="0"/>
-                <w:i w:val="0"/>
-                <w:color w:val="222222"/>
-                <w:sz w:val="16"/>
-              </w:rPr>
-              <w:t>0.4972</w:t>
-            </w:r>
-          </w:p>
-        </w:tc>
-        <w:tc>
-          <w:tcPr>
-            <w:tcW w:type="dxa" w:w="2282"/>
-            <w:vAlign w:val="center"/>
-            <w:tcMar>
-              <w:top w:w="70" w:type="dxa"/>
-              <w:bottom w:w="70" w:type="dxa"/>
-              <w:left w:w="70" w:type="dxa"/>
-              <w:right w:w="70" w:type="dxa"/>
-            </w:tcMar>
-          </w:tcPr>
-          <w:p>
-            <w:pPr>
-              <w:spacing w:after="0"/>
-              <w:jc w:val="center"/>
-            </w:pPr>
-            <w:r/>
-            <w:r>
-              <w:rPr>
-                <w:rFonts w:ascii="Times New Roman" w:hAnsi="Times New Roman" w:eastAsia="宋体"/>
-                <w:b w:val="0"/>
-                <w:i w:val="0"/>
-                <w:color w:val="222222"/>
-                <w:sz w:val="16"/>
-              </w:rPr>
-              <w:t>0.1145</w:t>
-            </w:r>
-          </w:p>
-        </w:tc>
-      </w:tr>
-      <w:tr>
-        <w:tc>
-          <w:tcPr>
-            <w:tcW w:type="dxa" w:w="2282"/>
-            <w:shd w:fill="F7F9FC"/>
-            <w:vAlign w:val="center"/>
-            <w:tcMar>
-              <w:top w:w="70" w:type="dxa"/>
-              <w:bottom w:w="70" w:type="dxa"/>
-              <w:left w:w="70" w:type="dxa"/>
-              <w:right w:w="70" w:type="dxa"/>
-            </w:tcMar>
-          </w:tcPr>
-          <w:p>
-            <w:pPr>
-              <w:spacing w:after="0"/>
-              <w:jc w:val="left"/>
-            </w:pPr>
-            <w:r/>
-            <w:r>
-              <w:rPr>
-                <w:rFonts w:ascii="Times New Roman" w:hAnsi="Times New Roman" w:eastAsia="宋体"/>
-                <w:b w:val="0"/>
-                <w:i w:val="0"/>
-                <w:color w:val="222222"/>
-                <w:sz w:val="16"/>
-              </w:rPr>
-              <w:t>M4 CatBoost 残差</w:t>
-            </w:r>
-          </w:p>
-        </w:tc>
-        <w:tc>
-          <w:tcPr>
-            <w:tcW w:type="dxa" w:w="2282"/>
-            <w:shd w:fill="F7F9FC"/>
-            <w:vAlign w:val="center"/>
-            <w:tcMar>
-              <w:top w:w="70" w:type="dxa"/>
-              <w:bottom w:w="70" w:type="dxa"/>
-              <w:left w:w="70" w:type="dxa"/>
-              <w:right w:w="70" w:type="dxa"/>
-            </w:tcMar>
-          </w:tcPr>
-          <w:p>
-            <w:pPr>
-              <w:spacing w:after="0"/>
-              <w:jc w:val="center"/>
-            </w:pPr>
-            <w:r/>
-            <w:r>
-              <w:rPr>
-                <w:rFonts w:ascii="Times New Roman" w:hAnsi="Times New Roman" w:eastAsia="宋体"/>
-                <w:b w:val="0"/>
-                <w:i w:val="0"/>
-                <w:color w:val="222222"/>
-                <w:sz w:val="16"/>
-              </w:rPr>
-              <w:t>残差主模型</w:t>
-            </w:r>
-          </w:p>
-        </w:tc>
-        <w:tc>
-          <w:tcPr>
-            <w:tcW w:type="dxa" w:w="2282"/>
-            <w:shd w:fill="F7F9FC"/>
-            <w:vAlign w:val="center"/>
-            <w:tcMar>
-              <w:top w:w="70" w:type="dxa"/>
-              <w:bottom w:w="70" w:type="dxa"/>
-              <w:left w:w="70" w:type="dxa"/>
-              <w:right w:w="70" w:type="dxa"/>
-            </w:tcMar>
-          </w:tcPr>
-          <w:p>
-            <w:pPr>
-              <w:spacing w:after="0"/>
-              <w:jc w:val="center"/>
-            </w:pPr>
-            <w:r/>
-            <w:r>
-              <w:rPr>
-                <w:rFonts w:ascii="Times New Roman" w:hAnsi="Times New Roman" w:eastAsia="宋体"/>
-                <w:b w:val="0"/>
-                <w:i w:val="0"/>
-                <w:color w:val="222222"/>
-                <w:sz w:val="16"/>
-              </w:rPr>
-              <w:t>0.8252</w:t>
-            </w:r>
-          </w:p>
-        </w:tc>
-        <w:tc>
-          <w:tcPr>
-            <w:tcW w:type="dxa" w:w="2282"/>
-            <w:shd w:fill="F7F9FC"/>
-            <w:vAlign w:val="center"/>
-            <w:tcMar>
-              <w:top w:w="70" w:type="dxa"/>
-              <w:bottom w:w="70" w:type="dxa"/>
-              <w:left w:w="70" w:type="dxa"/>
-              <w:right w:w="70" w:type="dxa"/>
-            </w:tcMar>
-          </w:tcPr>
-          <w:p>
-            <w:pPr>
-              <w:spacing w:after="0"/>
-              <w:jc w:val="center"/>
-            </w:pPr>
-            <w:r/>
-            <w:r>
-              <w:rPr>
-                <w:rFonts w:ascii="Times New Roman" w:hAnsi="Times New Roman" w:eastAsia="宋体"/>
-                <w:b w:val="0"/>
-                <w:i w:val="0"/>
-                <w:color w:val="222222"/>
-                <w:sz w:val="16"/>
-              </w:rPr>
-              <w:t>1.1203</w:t>
-            </w:r>
-          </w:p>
-        </w:tc>
-      </w:tr>
-      <w:tr>
-        <w:tc>
-          <w:tcPr>
-            <w:tcW w:type="dxa" w:w="2282"/>
-            <w:vAlign w:val="center"/>
-            <w:tcMar>
-              <w:top w:w="70" w:type="dxa"/>
-              <w:bottom w:w="70" w:type="dxa"/>
-              <w:left w:w="70" w:type="dxa"/>
-              <w:right w:w="70" w:type="dxa"/>
-            </w:tcMar>
-          </w:tcPr>
-          <w:p>
-            <w:pPr>
-              <w:spacing w:after="0"/>
-              <w:jc w:val="left"/>
-            </w:pPr>
-            <w:r/>
-            <w:r>
-              <w:rPr>
-                <w:rFonts w:ascii="Times New Roman" w:hAnsi="Times New Roman" w:eastAsia="宋体"/>
-                <w:b w:val="0"/>
-                <w:i w:val="0"/>
-                <w:color w:val="222222"/>
-                <w:sz w:val="16"/>
-              </w:rPr>
-              <w:t>M3a CatBoost 直接：历史</w:t>
-            </w:r>
-          </w:p>
-        </w:tc>
-        <w:tc>
-          <w:tcPr>
-            <w:tcW w:type="dxa" w:w="2282"/>
-            <w:vAlign w:val="center"/>
-            <w:tcMar>
-              <w:top w:w="70" w:type="dxa"/>
-              <w:bottom w:w="70" w:type="dxa"/>
-              <w:left w:w="70" w:type="dxa"/>
-              <w:right w:w="70" w:type="dxa"/>
-            </w:tcMar>
-          </w:tcPr>
-          <w:p>
-            <w:pPr>
-              <w:spacing w:after="0"/>
-              <w:jc w:val="center"/>
-            </w:pPr>
-            <w:r/>
-            <w:r>
-              <w:rPr>
-                <w:rFonts w:ascii="Times New Roman" w:hAnsi="Times New Roman" w:eastAsia="宋体"/>
-                <w:b w:val="0"/>
-                <w:i w:val="0"/>
-                <w:color w:val="222222"/>
-                <w:sz w:val="16"/>
-              </w:rPr>
-              <w:t>直预测消融</w:t>
-            </w:r>
-          </w:p>
-        </w:tc>
-        <w:tc>
-          <w:tcPr>
-            <w:tcW w:type="dxa" w:w="2282"/>
-            <w:vAlign w:val="center"/>
-            <w:tcMar>
-              <w:top w:w="70" w:type="dxa"/>
-              <w:bottom w:w="70" w:type="dxa"/>
-              <w:left w:w="70" w:type="dxa"/>
-              <w:right w:w="70" w:type="dxa"/>
-            </w:tcMar>
-          </w:tcPr>
-          <w:p>
-            <w:pPr>
-              <w:spacing w:after="0"/>
-              <w:jc w:val="center"/>
-            </w:pPr>
-            <w:r/>
-            <w:r>
-              <w:rPr>
-                <w:rFonts w:ascii="Times New Roman" w:hAnsi="Times New Roman" w:eastAsia="宋体"/>
-                <w:b w:val="0"/>
-                <w:i w:val="0"/>
-                <w:color w:val="222222"/>
-                <w:sz w:val="16"/>
-              </w:rPr>
-              <w:t>0.5543</w:t>
-            </w:r>
-          </w:p>
-        </w:tc>
-        <w:tc>
-          <w:tcPr>
-            <w:tcW w:type="dxa" w:w="2282"/>
-            <w:vAlign w:val="center"/>
-            <w:tcMar>
-              <w:top w:w="70" w:type="dxa"/>
-              <w:bottom w:w="70" w:type="dxa"/>
-              <w:left w:w="70" w:type="dxa"/>
-              <w:right w:w="70" w:type="dxa"/>
-            </w:tcMar>
-          </w:tcPr>
-          <w:p>
-            <w:pPr>
-              <w:spacing w:after="0"/>
-              <w:jc w:val="center"/>
-            </w:pPr>
-            <w:r/>
-            <w:r>
-              <w:rPr>
-                <w:rFonts w:ascii="Times New Roman" w:hAnsi="Times New Roman" w:eastAsia="宋体"/>
-                <w:b w:val="0"/>
-                <w:i w:val="0"/>
-                <w:color w:val="222222"/>
-                <w:sz w:val="16"/>
-              </w:rPr>
-              <w:t>0.7004</w:t>
-            </w:r>
-          </w:p>
-        </w:tc>
-      </w:tr>
-      <w:tr>
-        <w:tc>
-          <w:tcPr>
-            <w:tcW w:type="dxa" w:w="2282"/>
-            <w:shd w:fill="F7F9FC"/>
-            <w:vAlign w:val="center"/>
-            <w:tcMar>
-              <w:top w:w="70" w:type="dxa"/>
-              <w:bottom w:w="70" w:type="dxa"/>
-              <w:left w:w="70" w:type="dxa"/>
-              <w:right w:w="70" w:type="dxa"/>
-            </w:tcMar>
-          </w:tcPr>
-          <w:p>
-            <w:pPr>
-              <w:spacing w:after="0"/>
-              <w:jc w:val="left"/>
-            </w:pPr>
-            <w:r/>
-            <w:r>
-              <w:rPr>
-                <w:rFonts w:ascii="Times New Roman" w:hAnsi="Times New Roman" w:eastAsia="宋体"/>
-                <w:b w:val="0"/>
-                <w:i w:val="0"/>
-                <w:color w:val="222222"/>
-                <w:sz w:val="16"/>
-              </w:rPr>
-              <w:t>M3b CatBoost 直接：历史+行业</w:t>
-            </w:r>
-          </w:p>
-        </w:tc>
-        <w:tc>
-          <w:tcPr>
-            <w:tcW w:type="dxa" w:w="2282"/>
-            <w:shd w:fill="F7F9FC"/>
-            <w:vAlign w:val="center"/>
-            <w:tcMar>
-              <w:top w:w="70" w:type="dxa"/>
-              <w:bottom w:w="70" w:type="dxa"/>
-              <w:left w:w="70" w:type="dxa"/>
-              <w:right w:w="70" w:type="dxa"/>
-            </w:tcMar>
-          </w:tcPr>
-          <w:p>
-            <w:pPr>
-              <w:spacing w:after="0"/>
-              <w:jc w:val="center"/>
-            </w:pPr>
-            <w:r/>
-            <w:r>
-              <w:rPr>
-                <w:rFonts w:ascii="Times New Roman" w:hAnsi="Times New Roman" w:eastAsia="宋体"/>
-                <w:b w:val="0"/>
-                <w:i w:val="0"/>
-                <w:color w:val="222222"/>
-                <w:sz w:val="16"/>
-              </w:rPr>
-              <w:t>行业消融</w:t>
-            </w:r>
-          </w:p>
-        </w:tc>
-        <w:tc>
-          <w:tcPr>
-            <w:tcW w:type="dxa" w:w="2282"/>
-            <w:shd w:fill="F7F9FC"/>
-            <w:vAlign w:val="center"/>
-            <w:tcMar>
-              <w:top w:w="70" w:type="dxa"/>
-              <w:bottom w:w="70" w:type="dxa"/>
-              <w:left w:w="70" w:type="dxa"/>
-              <w:right w:w="70" w:type="dxa"/>
-            </w:tcMar>
-          </w:tcPr>
-          <w:p>
-            <w:pPr>
-              <w:spacing w:after="0"/>
-              <w:jc w:val="center"/>
-            </w:pPr>
-            <w:r/>
-            <w:r>
-              <w:rPr>
-                <w:rFonts w:ascii="Times New Roman" w:hAnsi="Times New Roman" w:eastAsia="宋体"/>
-                <w:b w:val="0"/>
-                <w:i w:val="0"/>
-                <w:color w:val="222222"/>
-                <w:sz w:val="16"/>
-              </w:rPr>
-              <w:t>0.5695</w:t>
-            </w:r>
-          </w:p>
-        </w:tc>
-        <w:tc>
-          <w:tcPr>
-            <w:tcW w:type="dxa" w:w="2282"/>
-            <w:shd w:fill="F7F9FC"/>
-            <w:vAlign w:val="center"/>
-            <w:tcMar>
-              <w:top w:w="70" w:type="dxa"/>
-              <w:bottom w:w="70" w:type="dxa"/>
-              <w:left w:w="70" w:type="dxa"/>
-              <w:right w:w="70" w:type="dxa"/>
-            </w:tcMar>
-          </w:tcPr>
-          <w:p>
-            <w:pPr>
-              <w:spacing w:after="0"/>
-              <w:jc w:val="center"/>
-            </w:pPr>
-            <w:r/>
-            <w:r>
-              <w:rPr>
-                <w:rFonts w:ascii="Times New Roman" w:hAnsi="Times New Roman" w:eastAsia="宋体"/>
-                <w:b w:val="0"/>
-                <w:i w:val="0"/>
-                <w:color w:val="222222"/>
-                <w:sz w:val="16"/>
-              </w:rPr>
-              <w:t>2.1825</w:t>
-            </w:r>
-          </w:p>
-        </w:tc>
-      </w:tr>
-      <w:tr>
-        <w:tc>
-          <w:tcPr>
-            <w:tcW w:type="dxa" w:w="2282"/>
-            <w:vAlign w:val="center"/>
-            <w:tcMar>
-              <w:top w:w="70" w:type="dxa"/>
-              <w:bottom w:w="70" w:type="dxa"/>
-              <w:left w:w="70" w:type="dxa"/>
-              <w:right w:w="70" w:type="dxa"/>
-            </w:tcMar>
-          </w:tcPr>
-          <w:p>
-            <w:pPr>
-              <w:spacing w:after="0"/>
-              <w:jc w:val="left"/>
-            </w:pPr>
-            <w:r/>
-            <w:r>
-              <w:rPr>
-                <w:rFonts w:ascii="Times New Roman" w:hAnsi="Times New Roman" w:eastAsia="宋体"/>
-                <w:b w:val="0"/>
-                <w:i w:val="0"/>
-                <w:color w:val="222222"/>
-                <w:sz w:val="16"/>
-              </w:rPr>
-              <w:t>M3c CatBoost 直接：历史+元数据</w:t>
-            </w:r>
-          </w:p>
-        </w:tc>
-        <w:tc>
-          <w:tcPr>
-            <w:tcW w:type="dxa" w:w="2282"/>
-            <w:vAlign w:val="center"/>
-            <w:tcMar>
-              <w:top w:w="70" w:type="dxa"/>
-              <w:bottom w:w="70" w:type="dxa"/>
-              <w:left w:w="70" w:type="dxa"/>
-              <w:right w:w="70" w:type="dxa"/>
-            </w:tcMar>
-          </w:tcPr>
-          <w:p>
-            <w:pPr>
-              <w:spacing w:after="0"/>
-              <w:jc w:val="center"/>
-            </w:pPr>
-            <w:r/>
-            <w:r>
-              <w:rPr>
-                <w:rFonts w:ascii="Times New Roman" w:hAnsi="Times New Roman" w:eastAsia="宋体"/>
-                <w:b w:val="0"/>
-                <w:i w:val="0"/>
-                <w:color w:val="222222"/>
-                <w:sz w:val="16"/>
-              </w:rPr>
-              <w:t>元数据消融</w:t>
-            </w:r>
-          </w:p>
-        </w:tc>
-        <w:tc>
-          <w:tcPr>
-            <w:tcW w:type="dxa" w:w="2282"/>
-            <w:vAlign w:val="center"/>
-            <w:tcMar>
-              <w:top w:w="70" w:type="dxa"/>
-              <w:bottom w:w="70" w:type="dxa"/>
-              <w:left w:w="70" w:type="dxa"/>
-              <w:right w:w="70" w:type="dxa"/>
-            </w:tcMar>
-          </w:tcPr>
-          <w:p>
-            <w:pPr>
-              <w:spacing w:after="0"/>
-              <w:jc w:val="center"/>
-            </w:pPr>
-            <w:r/>
-            <w:r>
-              <w:rPr>
-                <w:rFonts w:ascii="Times New Roman" w:hAnsi="Times New Roman" w:eastAsia="宋体"/>
-                <w:b w:val="0"/>
-                <w:i w:val="0"/>
-                <w:color w:val="222222"/>
-                <w:sz w:val="16"/>
-              </w:rPr>
-              <w:t>0.6084</w:t>
-            </w:r>
-          </w:p>
-        </w:tc>
-        <w:tc>
-          <w:tcPr>
-            <w:tcW w:type="dxa" w:w="2282"/>
-            <w:vAlign w:val="center"/>
-            <w:tcMar>
-              <w:top w:w="70" w:type="dxa"/>
-              <w:bottom w:w="70" w:type="dxa"/>
-              <w:left w:w="70" w:type="dxa"/>
-              <w:right w:w="70" w:type="dxa"/>
-            </w:tcMar>
-          </w:tcPr>
-          <w:p>
-            <w:pPr>
-              <w:spacing w:after="0"/>
-              <w:jc w:val="center"/>
-            </w:pPr>
-            <w:r/>
-            <w:r>
-              <w:rPr>
-                <w:rFonts w:ascii="Times New Roman" w:hAnsi="Times New Roman" w:eastAsia="宋体"/>
-                <w:b w:val="0"/>
-                <w:i w:val="0"/>
-                <w:color w:val="222222"/>
-                <w:sz w:val="16"/>
-              </w:rPr>
-              <w:t>1.3768</w:t>
+              <w:t>0.2543</w:t>
             </w:r>
           </w:p>
         </w:tc>
@@ -9071,7 +8170,7 @@
                 <w:color w:val="222222"/>
                 <w:sz w:val="16"/>
               </w:rPr>
-              <w:t>0.6090</w:t>
+              <w:t>0.6147</w:t>
             </w:r>
           </w:p>
         </w:tc>
@@ -9101,7 +8200,7 @@
                 <w:color w:val="222222"/>
                 <w:sz w:val="16"/>
               </w:rPr>
-              <w:t>0.4335</w:t>
+              <w:t>0.0932</w:t>
             </w:r>
           </w:p>
         </w:tc>
@@ -9132,7 +8231,7 @@
                 <w:color w:val="222222"/>
                 <w:sz w:val="16"/>
               </w:rPr>
-              <w:t>M6 逐目标 OOF 融合</w:t>
+              <w:t>M3b CatBoost 直接：历史+行业</w:t>
             </w:r>
           </w:p>
         </w:tc>
@@ -9161,7 +8260,7 @@
                 <w:color w:val="222222"/>
                 <w:sz w:val="16"/>
               </w:rPr>
-              <w:t>最终模型</w:t>
+              <w:t>行业消融</w:t>
             </w:r>
           </w:p>
         </w:tc>
@@ -9190,7 +8289,7 @@
                 <w:color w:val="222222"/>
                 <w:sz w:val="16"/>
               </w:rPr>
-              <w:t>0.8572</w:t>
+              <w:t>0.6130</w:t>
             </w:r>
           </w:p>
         </w:tc>
@@ -9219,7 +8318,727 @@
                 <w:color w:val="222222"/>
                 <w:sz w:val="16"/>
               </w:rPr>
-              <w:t>0.0490</w:t>
+              <w:t>0.0931</w:t>
+            </w:r>
+          </w:p>
+        </w:tc>
+      </w:tr>
+      <w:tr>
+        <w:tc>
+          <w:tcPr>
+            <w:tcW w:type="dxa" w:w="2282"/>
+            <w:shd w:fill="F7F9FC"/>
+            <w:vAlign w:val="center"/>
+            <w:tcMar>
+              <w:top w:w="70" w:type="dxa"/>
+              <w:bottom w:w="70" w:type="dxa"/>
+              <w:left w:w="70" w:type="dxa"/>
+              <w:right w:w="70" w:type="dxa"/>
+            </w:tcMar>
+          </w:tcPr>
+          <w:p>
+            <w:pPr>
+              <w:spacing w:after="0"/>
+              <w:jc w:val="left"/>
+            </w:pPr>
+            <w:r/>
+            <w:r>
+              <w:rPr>
+                <w:rFonts w:ascii="Times New Roman" w:hAnsi="Times New Roman" w:eastAsia="宋体"/>
+                <w:b w:val="0"/>
+                <w:i w:val="0"/>
+                <w:color w:val="222222"/>
+                <w:sz w:val="16"/>
+              </w:rPr>
+              <w:t>M3c CatBoost 直接：历史+元数据</w:t>
+            </w:r>
+          </w:p>
+        </w:tc>
+        <w:tc>
+          <w:tcPr>
+            <w:tcW w:type="dxa" w:w="2282"/>
+            <w:shd w:fill="F7F9FC"/>
+            <w:vAlign w:val="center"/>
+            <w:tcMar>
+              <w:top w:w="70" w:type="dxa"/>
+              <w:bottom w:w="70" w:type="dxa"/>
+              <w:left w:w="70" w:type="dxa"/>
+              <w:right w:w="70" w:type="dxa"/>
+            </w:tcMar>
+          </w:tcPr>
+          <w:p>
+            <w:pPr>
+              <w:spacing w:after="0"/>
+              <w:jc w:val="center"/>
+            </w:pPr>
+            <w:r/>
+            <w:r>
+              <w:rPr>
+                <w:rFonts w:ascii="Times New Roman" w:hAnsi="Times New Roman" w:eastAsia="宋体"/>
+                <w:b w:val="0"/>
+                <w:i w:val="0"/>
+                <w:color w:val="222222"/>
+                <w:sz w:val="16"/>
+              </w:rPr>
+              <w:t>元数据消融</w:t>
+            </w:r>
+          </w:p>
+        </w:tc>
+        <w:tc>
+          <w:tcPr>
+            <w:tcW w:type="dxa" w:w="2282"/>
+            <w:shd w:fill="F7F9FC"/>
+            <w:vAlign w:val="center"/>
+            <w:tcMar>
+              <w:top w:w="70" w:type="dxa"/>
+              <w:bottom w:w="70" w:type="dxa"/>
+              <w:left w:w="70" w:type="dxa"/>
+              <w:right w:w="70" w:type="dxa"/>
+            </w:tcMar>
+          </w:tcPr>
+          <w:p>
+            <w:pPr>
+              <w:spacing w:after="0"/>
+              <w:jc w:val="center"/>
+            </w:pPr>
+            <w:r/>
+            <w:r>
+              <w:rPr>
+                <w:rFonts w:ascii="Times New Roman" w:hAnsi="Times New Roman" w:eastAsia="宋体"/>
+                <w:b w:val="0"/>
+                <w:i w:val="0"/>
+                <w:color w:val="222222"/>
+                <w:sz w:val="16"/>
+              </w:rPr>
+              <w:t>0.6084</w:t>
+            </w:r>
+          </w:p>
+        </w:tc>
+        <w:tc>
+          <w:tcPr>
+            <w:tcW w:type="dxa" w:w="2282"/>
+            <w:shd w:fill="F7F9FC"/>
+            <w:vAlign w:val="center"/>
+            <w:tcMar>
+              <w:top w:w="70" w:type="dxa"/>
+              <w:bottom w:w="70" w:type="dxa"/>
+              <w:left w:w="70" w:type="dxa"/>
+              <w:right w:w="70" w:type="dxa"/>
+            </w:tcMar>
+          </w:tcPr>
+          <w:p>
+            <w:pPr>
+              <w:spacing w:after="0"/>
+              <w:jc w:val="center"/>
+            </w:pPr>
+            <w:r/>
+            <w:r>
+              <w:rPr>
+                <w:rFonts w:ascii="Times New Roman" w:hAnsi="Times New Roman" w:eastAsia="宋体"/>
+                <w:b w:val="0"/>
+                <w:i w:val="0"/>
+                <w:color w:val="222222"/>
+                <w:sz w:val="16"/>
+              </w:rPr>
+              <w:t>0.0955</w:t>
+            </w:r>
+          </w:p>
+        </w:tc>
+      </w:tr>
+      <w:tr>
+        <w:tc>
+          <w:tcPr>
+            <w:tcW w:type="dxa" w:w="2282"/>
+            <w:vAlign w:val="center"/>
+            <w:tcMar>
+              <w:top w:w="70" w:type="dxa"/>
+              <w:bottom w:w="70" w:type="dxa"/>
+              <w:left w:w="70" w:type="dxa"/>
+              <w:right w:w="70" w:type="dxa"/>
+            </w:tcMar>
+          </w:tcPr>
+          <w:p>
+            <w:pPr>
+              <w:spacing w:after="0"/>
+              <w:jc w:val="left"/>
+            </w:pPr>
+            <w:r/>
+            <w:r>
+              <w:rPr>
+                <w:rFonts w:ascii="Times New Roman" w:hAnsi="Times New Roman" w:eastAsia="宋体"/>
+                <w:b w:val="0"/>
+                <w:i w:val="0"/>
+                <w:color w:val="222222"/>
+                <w:sz w:val="16"/>
+              </w:rPr>
+              <w:t>M3a CatBoost 直接：历史</w:t>
+            </w:r>
+          </w:p>
+        </w:tc>
+        <w:tc>
+          <w:tcPr>
+            <w:tcW w:type="dxa" w:w="2282"/>
+            <w:vAlign w:val="center"/>
+            <w:tcMar>
+              <w:top w:w="70" w:type="dxa"/>
+              <w:bottom w:w="70" w:type="dxa"/>
+              <w:left w:w="70" w:type="dxa"/>
+              <w:right w:w="70" w:type="dxa"/>
+            </w:tcMar>
+          </w:tcPr>
+          <w:p>
+            <w:pPr>
+              <w:spacing w:after="0"/>
+              <w:jc w:val="center"/>
+            </w:pPr>
+            <w:r/>
+            <w:r>
+              <w:rPr>
+                <w:rFonts w:ascii="Times New Roman" w:hAnsi="Times New Roman" w:eastAsia="宋体"/>
+                <w:b w:val="0"/>
+                <w:i w:val="0"/>
+                <w:color w:val="222222"/>
+                <w:sz w:val="16"/>
+              </w:rPr>
+              <w:t>直预测消融</w:t>
+            </w:r>
+          </w:p>
+        </w:tc>
+        <w:tc>
+          <w:tcPr>
+            <w:tcW w:type="dxa" w:w="2282"/>
+            <w:vAlign w:val="center"/>
+            <w:tcMar>
+              <w:top w:w="70" w:type="dxa"/>
+              <w:bottom w:w="70" w:type="dxa"/>
+              <w:left w:w="70" w:type="dxa"/>
+              <w:right w:w="70" w:type="dxa"/>
+            </w:tcMar>
+          </w:tcPr>
+          <w:p>
+            <w:pPr>
+              <w:spacing w:after="0"/>
+              <w:jc w:val="center"/>
+            </w:pPr>
+            <w:r/>
+            <w:r>
+              <w:rPr>
+                <w:rFonts w:ascii="Times New Roman" w:hAnsi="Times New Roman" w:eastAsia="宋体"/>
+                <w:b w:val="0"/>
+                <w:i w:val="0"/>
+                <w:color w:val="222222"/>
+                <w:sz w:val="16"/>
+              </w:rPr>
+              <w:t>0.6067</w:t>
+            </w:r>
+          </w:p>
+        </w:tc>
+        <w:tc>
+          <w:tcPr>
+            <w:tcW w:type="dxa" w:w="2282"/>
+            <w:vAlign w:val="center"/>
+            <w:tcMar>
+              <w:top w:w="70" w:type="dxa"/>
+              <w:bottom w:w="70" w:type="dxa"/>
+              <w:left w:w="70" w:type="dxa"/>
+              <w:right w:w="70" w:type="dxa"/>
+            </w:tcMar>
+          </w:tcPr>
+          <w:p>
+            <w:pPr>
+              <w:spacing w:after="0"/>
+              <w:jc w:val="center"/>
+            </w:pPr>
+            <w:r/>
+            <w:r>
+              <w:rPr>
+                <w:rFonts w:ascii="Times New Roman" w:hAnsi="Times New Roman" w:eastAsia="宋体"/>
+                <w:b w:val="0"/>
+                <w:i w:val="0"/>
+                <w:color w:val="222222"/>
+                <w:sz w:val="16"/>
+              </w:rPr>
+              <w:t>0.0981</w:t>
+            </w:r>
+          </w:p>
+        </w:tc>
+      </w:tr>
+      <w:tr>
+        <w:tc>
+          <w:tcPr>
+            <w:tcW w:type="dxa" w:w="2282"/>
+            <w:shd w:fill="F7F9FC"/>
+            <w:vAlign w:val="center"/>
+            <w:tcMar>
+              <w:top w:w="70" w:type="dxa"/>
+              <w:bottom w:w="70" w:type="dxa"/>
+              <w:left w:w="70" w:type="dxa"/>
+              <w:right w:w="70" w:type="dxa"/>
+            </w:tcMar>
+          </w:tcPr>
+          <w:p>
+            <w:pPr>
+              <w:spacing w:after="0"/>
+              <w:jc w:val="left"/>
+            </w:pPr>
+            <w:r/>
+            <w:r>
+              <w:rPr>
+                <w:rFonts w:ascii="Times New Roman" w:hAnsi="Times New Roman" w:eastAsia="宋体"/>
+                <w:b w:val="0"/>
+                <w:i w:val="0"/>
+                <w:color w:val="222222"/>
+                <w:sz w:val="16"/>
+              </w:rPr>
+              <w:t>M2 HistGBR</w:t>
+            </w:r>
+          </w:p>
+        </w:tc>
+        <w:tc>
+          <w:tcPr>
+            <w:tcW w:type="dxa" w:w="2282"/>
+            <w:shd w:fill="F7F9FC"/>
+            <w:vAlign w:val="center"/>
+            <w:tcMar>
+              <w:top w:w="70" w:type="dxa"/>
+              <w:bottom w:w="70" w:type="dxa"/>
+              <w:left w:w="70" w:type="dxa"/>
+              <w:right w:w="70" w:type="dxa"/>
+            </w:tcMar>
+          </w:tcPr>
+          <w:p>
+            <w:pPr>
+              <w:spacing w:after="0"/>
+              <w:jc w:val="center"/>
+            </w:pPr>
+            <w:r/>
+            <w:r>
+              <w:rPr>
+                <w:rFonts w:ascii="Times New Roman" w:hAnsi="Times New Roman" w:eastAsia="宋体"/>
+                <w:b w:val="0"/>
+                <w:i w:val="0"/>
+                <w:color w:val="222222"/>
+                <w:sz w:val="16"/>
+              </w:rPr>
+              <w:t>非线性对照</w:t>
+            </w:r>
+          </w:p>
+        </w:tc>
+        <w:tc>
+          <w:tcPr>
+            <w:tcW w:type="dxa" w:w="2282"/>
+            <w:shd w:fill="F7F9FC"/>
+            <w:vAlign w:val="center"/>
+            <w:tcMar>
+              <w:top w:w="70" w:type="dxa"/>
+              <w:bottom w:w="70" w:type="dxa"/>
+              <w:left w:w="70" w:type="dxa"/>
+              <w:right w:w="70" w:type="dxa"/>
+            </w:tcMar>
+          </w:tcPr>
+          <w:p>
+            <w:pPr>
+              <w:spacing w:after="0"/>
+              <w:jc w:val="center"/>
+            </w:pPr>
+            <w:r/>
+            <w:r>
+              <w:rPr>
+                <w:rFonts w:ascii="Times New Roman" w:hAnsi="Times New Roman" w:eastAsia="宋体"/>
+                <w:b w:val="0"/>
+                <w:i w:val="0"/>
+                <w:color w:val="222222"/>
+                <w:sz w:val="16"/>
+              </w:rPr>
+              <w:t>0.5992</w:t>
+            </w:r>
+          </w:p>
+        </w:tc>
+        <w:tc>
+          <w:tcPr>
+            <w:tcW w:type="dxa" w:w="2282"/>
+            <w:shd w:fill="F7F9FC"/>
+            <w:vAlign w:val="center"/>
+            <w:tcMar>
+              <w:top w:w="70" w:type="dxa"/>
+              <w:bottom w:w="70" w:type="dxa"/>
+              <w:left w:w="70" w:type="dxa"/>
+              <w:right w:w="70" w:type="dxa"/>
+            </w:tcMar>
+          </w:tcPr>
+          <w:p>
+            <w:pPr>
+              <w:spacing w:after="0"/>
+              <w:jc w:val="center"/>
+            </w:pPr>
+            <w:r/>
+            <w:r>
+              <w:rPr>
+                <w:rFonts w:ascii="Times New Roman" w:hAnsi="Times New Roman" w:eastAsia="宋体"/>
+                <w:b w:val="0"/>
+                <w:i w:val="0"/>
+                <w:color w:val="222222"/>
+                <w:sz w:val="16"/>
+              </w:rPr>
+              <w:t>0.1084</w:t>
+            </w:r>
+          </w:p>
+        </w:tc>
+      </w:tr>
+      <w:tr>
+        <w:tc>
+          <w:tcPr>
+            <w:tcW w:type="dxa" w:w="2282"/>
+            <w:vAlign w:val="center"/>
+            <w:tcMar>
+              <w:top w:w="70" w:type="dxa"/>
+              <w:bottom w:w="70" w:type="dxa"/>
+              <w:left w:w="70" w:type="dxa"/>
+              <w:right w:w="70" w:type="dxa"/>
+            </w:tcMar>
+          </w:tcPr>
+          <w:p>
+            <w:pPr>
+              <w:spacing w:after="0"/>
+              <w:jc w:val="left"/>
+            </w:pPr>
+            <w:r/>
+            <w:r>
+              <w:rPr>
+                <w:rFonts w:ascii="Times New Roman" w:hAnsi="Times New Roman" w:eastAsia="宋体"/>
+                <w:b w:val="0"/>
+                <w:i w:val="0"/>
+                <w:color w:val="222222"/>
+                <w:sz w:val="16"/>
+              </w:rPr>
+              <w:t>B3 短趋势外推</w:t>
+            </w:r>
+          </w:p>
+        </w:tc>
+        <w:tc>
+          <w:tcPr>
+            <w:tcW w:type="dxa" w:w="2282"/>
+            <w:vAlign w:val="center"/>
+            <w:tcMar>
+              <w:top w:w="70" w:type="dxa"/>
+              <w:bottom w:w="70" w:type="dxa"/>
+              <w:left w:w="70" w:type="dxa"/>
+              <w:right w:w="70" w:type="dxa"/>
+            </w:tcMar>
+          </w:tcPr>
+          <w:p>
+            <w:pPr>
+              <w:spacing w:after="0"/>
+              <w:jc w:val="center"/>
+            </w:pPr>
+            <w:r/>
+            <w:r>
+              <w:rPr>
+                <w:rFonts w:ascii="Times New Roman" w:hAnsi="Times New Roman" w:eastAsia="宋体"/>
+                <w:b w:val="0"/>
+                <w:i w:val="0"/>
+                <w:color w:val="222222"/>
+                <w:sz w:val="16"/>
+              </w:rPr>
+              <w:t>趋势规则</w:t>
+            </w:r>
+          </w:p>
+        </w:tc>
+        <w:tc>
+          <w:tcPr>
+            <w:tcW w:type="dxa" w:w="2282"/>
+            <w:vAlign w:val="center"/>
+            <w:tcMar>
+              <w:top w:w="70" w:type="dxa"/>
+              <w:bottom w:w="70" w:type="dxa"/>
+              <w:left w:w="70" w:type="dxa"/>
+              <w:right w:w="70" w:type="dxa"/>
+            </w:tcMar>
+          </w:tcPr>
+          <w:p>
+            <w:pPr>
+              <w:spacing w:after="0"/>
+              <w:jc w:val="center"/>
+            </w:pPr>
+            <w:r/>
+            <w:r>
+              <w:rPr>
+                <w:rFonts w:ascii="Times New Roman" w:hAnsi="Times New Roman" w:eastAsia="宋体"/>
+                <w:b w:val="0"/>
+                <w:i w:val="0"/>
+                <w:color w:val="222222"/>
+                <w:sz w:val="16"/>
+              </w:rPr>
+              <w:t>0.5004</w:t>
+            </w:r>
+          </w:p>
+        </w:tc>
+        <w:tc>
+          <w:tcPr>
+            <w:tcW w:type="dxa" w:w="2282"/>
+            <w:vAlign w:val="center"/>
+            <w:tcMar>
+              <w:top w:w="70" w:type="dxa"/>
+              <w:bottom w:w="70" w:type="dxa"/>
+              <w:left w:w="70" w:type="dxa"/>
+              <w:right w:w="70" w:type="dxa"/>
+            </w:tcMar>
+          </w:tcPr>
+          <w:p>
+            <w:pPr>
+              <w:spacing w:after="0"/>
+              <w:jc w:val="center"/>
+            </w:pPr>
+            <w:r/>
+            <w:r>
+              <w:rPr>
+                <w:rFonts w:ascii="Times New Roman" w:hAnsi="Times New Roman" w:eastAsia="宋体"/>
+                <w:b w:val="0"/>
+                <w:i w:val="0"/>
+                <w:color w:val="222222"/>
+                <w:sz w:val="16"/>
+              </w:rPr>
+              <w:t>0.2116</w:t>
+            </w:r>
+          </w:p>
+        </w:tc>
+      </w:tr>
+      <w:tr>
+        <w:tc>
+          <w:tcPr>
+            <w:tcW w:type="dxa" w:w="2282"/>
+            <w:shd w:fill="F7F9FC"/>
+            <w:vAlign w:val="center"/>
+            <w:tcMar>
+              <w:top w:w="70" w:type="dxa"/>
+              <w:bottom w:w="70" w:type="dxa"/>
+              <w:left w:w="70" w:type="dxa"/>
+              <w:right w:w="70" w:type="dxa"/>
+            </w:tcMar>
+          </w:tcPr>
+          <w:p>
+            <w:pPr>
+              <w:spacing w:after="0"/>
+              <w:jc w:val="left"/>
+            </w:pPr>
+            <w:r/>
+            <w:r>
+              <w:rPr>
+                <w:rFonts w:ascii="Times New Roman" w:hAnsi="Times New Roman" w:eastAsia="宋体"/>
+                <w:b w:val="0"/>
+                <w:i w:val="0"/>
+                <w:color w:val="222222"/>
+                <w:sz w:val="16"/>
+              </w:rPr>
+              <w:t>B2 季节性复制</w:t>
+            </w:r>
+          </w:p>
+        </w:tc>
+        <w:tc>
+          <w:tcPr>
+            <w:tcW w:type="dxa" w:w="2282"/>
+            <w:shd w:fill="F7F9FC"/>
+            <w:vAlign w:val="center"/>
+            <w:tcMar>
+              <w:top w:w="70" w:type="dxa"/>
+              <w:bottom w:w="70" w:type="dxa"/>
+              <w:left w:w="70" w:type="dxa"/>
+              <w:right w:w="70" w:type="dxa"/>
+            </w:tcMar>
+          </w:tcPr>
+          <w:p>
+            <w:pPr>
+              <w:spacing w:after="0"/>
+              <w:jc w:val="center"/>
+            </w:pPr>
+            <w:r/>
+            <w:r>
+              <w:rPr>
+                <w:rFonts w:ascii="Times New Roman" w:hAnsi="Times New Roman" w:eastAsia="宋体"/>
+                <w:b w:val="0"/>
+                <w:i w:val="0"/>
+                <w:color w:val="222222"/>
+                <w:sz w:val="16"/>
+              </w:rPr>
+              <w:t>季节性规则</w:t>
+            </w:r>
+          </w:p>
+        </w:tc>
+        <w:tc>
+          <w:tcPr>
+            <w:tcW w:type="dxa" w:w="2282"/>
+            <w:shd w:fill="F7F9FC"/>
+            <w:vAlign w:val="center"/>
+            <w:tcMar>
+              <w:top w:w="70" w:type="dxa"/>
+              <w:bottom w:w="70" w:type="dxa"/>
+              <w:left w:w="70" w:type="dxa"/>
+              <w:right w:w="70" w:type="dxa"/>
+            </w:tcMar>
+          </w:tcPr>
+          <w:p>
+            <w:pPr>
+              <w:spacing w:after="0"/>
+              <w:jc w:val="center"/>
+            </w:pPr>
+            <w:r/>
+            <w:r>
+              <w:rPr>
+                <w:rFonts w:ascii="Times New Roman" w:hAnsi="Times New Roman" w:eastAsia="宋体"/>
+                <w:b w:val="0"/>
+                <w:i w:val="0"/>
+                <w:color w:val="222222"/>
+                <w:sz w:val="16"/>
+              </w:rPr>
+              <w:t>0.3315</w:t>
+            </w:r>
+          </w:p>
+        </w:tc>
+        <w:tc>
+          <w:tcPr>
+            <w:tcW w:type="dxa" w:w="2282"/>
+            <w:shd w:fill="F7F9FC"/>
+            <w:vAlign w:val="center"/>
+            <w:tcMar>
+              <w:top w:w="70" w:type="dxa"/>
+              <w:bottom w:w="70" w:type="dxa"/>
+              <w:left w:w="70" w:type="dxa"/>
+              <w:right w:w="70" w:type="dxa"/>
+            </w:tcMar>
+          </w:tcPr>
+          <w:p>
+            <w:pPr>
+              <w:spacing w:after="0"/>
+              <w:jc w:val="center"/>
+            </w:pPr>
+            <w:r/>
+            <w:r>
+              <w:rPr>
+                <w:rFonts w:ascii="Times New Roman" w:hAnsi="Times New Roman" w:eastAsia="宋体"/>
+                <w:b w:val="0"/>
+                <w:i w:val="0"/>
+                <w:color w:val="222222"/>
+                <w:sz w:val="16"/>
+              </w:rPr>
+              <w:t>0.4688</w:t>
+            </w:r>
+          </w:p>
+        </w:tc>
+      </w:tr>
+      <w:tr>
+        <w:tc>
+          <w:tcPr>
+            <w:tcW w:type="dxa" w:w="2282"/>
+            <w:vAlign w:val="center"/>
+            <w:tcMar>
+              <w:top w:w="70" w:type="dxa"/>
+              <w:bottom w:w="70" w:type="dxa"/>
+              <w:left w:w="70" w:type="dxa"/>
+              <w:right w:w="70" w:type="dxa"/>
+            </w:tcMar>
+          </w:tcPr>
+          <w:p>
+            <w:pPr>
+              <w:spacing w:after="0"/>
+              <w:jc w:val="left"/>
+            </w:pPr>
+            <w:r/>
+            <w:r>
+              <w:rPr>
+                <w:rFonts w:ascii="Times New Roman" w:hAnsi="Times New Roman" w:eastAsia="宋体"/>
+                <w:b w:val="0"/>
+                <w:i w:val="0"/>
+                <w:color w:val="222222"/>
+                <w:sz w:val="16"/>
+              </w:rPr>
+              <w:t>B0 均值预测</w:t>
+            </w:r>
+          </w:p>
+        </w:tc>
+        <w:tc>
+          <w:tcPr>
+            <w:tcW w:type="dxa" w:w="2282"/>
+            <w:vAlign w:val="center"/>
+            <w:tcMar>
+              <w:top w:w="70" w:type="dxa"/>
+              <w:bottom w:w="70" w:type="dxa"/>
+              <w:left w:w="70" w:type="dxa"/>
+              <w:right w:w="70" w:type="dxa"/>
+            </w:tcMar>
+          </w:tcPr>
+          <w:p>
+            <w:pPr>
+              <w:spacing w:after="0"/>
+              <w:jc w:val="center"/>
+            </w:pPr>
+            <w:r/>
+            <w:r>
+              <w:rPr>
+                <w:rFonts w:ascii="Times New Roman" w:hAnsi="Times New Roman" w:eastAsia="宋体"/>
+                <w:b w:val="0"/>
+                <w:i w:val="0"/>
+                <w:color w:val="222222"/>
+                <w:sz w:val="16"/>
+              </w:rPr>
+              <w:t>指标校验</w:t>
+            </w:r>
+          </w:p>
+        </w:tc>
+        <w:tc>
+          <w:tcPr>
+            <w:tcW w:type="dxa" w:w="2282"/>
+            <w:vAlign w:val="center"/>
+            <w:tcMar>
+              <w:top w:w="70" w:type="dxa"/>
+              <w:bottom w:w="70" w:type="dxa"/>
+              <w:left w:w="70" w:type="dxa"/>
+              <w:right w:w="70" w:type="dxa"/>
+            </w:tcMar>
+          </w:tcPr>
+          <w:p>
+            <w:pPr>
+              <w:spacing w:after="0"/>
+              <w:jc w:val="center"/>
+            </w:pPr>
+            <w:r/>
+            <w:r>
+              <w:rPr>
+                <w:rFonts w:ascii="Times New Roman" w:hAnsi="Times New Roman" w:eastAsia="宋体"/>
+                <w:b w:val="0"/>
+                <w:i w:val="0"/>
+                <w:color w:val="222222"/>
+                <w:sz w:val="16"/>
+              </w:rPr>
+              <w:t>-0.0012</w:t>
+            </w:r>
+          </w:p>
+        </w:tc>
+        <w:tc>
+          <w:tcPr>
+            <w:tcW w:type="dxa" w:w="2282"/>
+            <w:vAlign w:val="center"/>
+            <w:tcMar>
+              <w:top w:w="70" w:type="dxa"/>
+              <w:bottom w:w="70" w:type="dxa"/>
+              <w:left w:w="70" w:type="dxa"/>
+              <w:right w:w="70" w:type="dxa"/>
+            </w:tcMar>
+          </w:tcPr>
+          <w:p>
+            <w:pPr>
+              <w:spacing w:after="0"/>
+              <w:jc w:val="center"/>
+            </w:pPr>
+            <w:r/>
+            <w:r>
+              <w:rPr>
+                <w:rFonts w:ascii="Times New Roman" w:hAnsi="Times New Roman" w:eastAsia="宋体"/>
+                <w:b w:val="0"/>
+                <w:i w:val="0"/>
+                <w:color w:val="222222"/>
+                <w:sz w:val="16"/>
+              </w:rPr>
+              <w:t>0.0040</w:t>
             </w:r>
           </w:p>
         </w:tc>
@@ -9290,7 +9109,7 @@
           <w:color w:val="222222"/>
           <w:sz w:val="21"/>
         </w:rPr>
-        <w:t>残差建模把任务拆为两层：先由 B4 解释稳定的历史惯性，再由 CatBoost 学习偏离惯性的部分。这种拆法降低了模型直接学习公司绝对规模的压力，M4 平均 R² 从 M3d 的 0.6090 提升到 0.8253。</w:t>
+        <w:t>残差建模把任务拆为两层：先由 B4 解释稳定的历史惯性，再由 CatBoost 学习偏离惯性的部分。这种拆法降低了模型直接学习公司绝对规模的压力，M4 平均 R² 从 M3d 的 0.6147 提升到 0.8376。</w:t>
       </w:r>
     </w:p>
     <w:p>
@@ -9301,7 +9120,7 @@
       <w:r>
         <w:drawing>
           <wp:inline xmlns:a="http://schemas.openxmlformats.org/drawingml/2006/main" xmlns:pic="http://schemas.openxmlformats.org/drawingml/2006/picture">
-            <wp:extent cx="5472000" cy="2986613"/>
+            <wp:extent cx="5472000" cy="2973464"/>
             <wp:docPr id="9" name="Picture 9"/>
             <wp:cNvGraphicFramePr>
               <a:graphicFrameLocks noChangeAspect="1"/>
@@ -9322,7 +9141,7 @@
                   <pic:spPr>
                     <a:xfrm>
                       <a:off x="0" y="0"/>
-                      <a:ext cx="5472000" cy="2986613"/>
+                      <a:ext cx="5472000" cy="2973464"/>
                     </a:xfrm>
                     <a:prstGeom prst="rect"/>
                   </pic:spPr>
@@ -9738,7 +9557,7 @@
                 <w:color w:val="222222"/>
                 <w:sz w:val="16"/>
               </w:rPr>
-              <w:t>0.7035</w:t>
+              <w:t>0.7259</w:t>
             </w:r>
           </w:p>
         </w:tc>
@@ -9767,7 +9586,7 @@
                 <w:color w:val="222222"/>
                 <w:sz w:val="16"/>
               </w:rPr>
-              <w:t>0.00,0.40,0.60</w:t>
+              <w:t>0.00,0.34,0.66</w:t>
             </w:r>
           </w:p>
         </w:tc>
@@ -9859,7 +9678,7 @@
                 <w:color w:val="222222"/>
                 <w:sz w:val="16"/>
               </w:rPr>
-              <w:t>0.9112</w:t>
+              <w:t>0.9189</w:t>
             </w:r>
           </w:p>
         </w:tc>
@@ -9978,7 +9797,7 @@
                 <w:color w:val="222222"/>
                 <w:sz w:val="16"/>
               </w:rPr>
-              <w:t>0.4009</w:t>
+              <w:t>0.3073</w:t>
             </w:r>
           </w:p>
         </w:tc>
@@ -10007,7 +9826,7 @@
                 <w:color w:val="222222"/>
                 <w:sz w:val="16"/>
               </w:rPr>
-              <w:t>0.00,1.00,0.00</w:t>
+              <w:t>0.00,0.69,0.31</w:t>
             </w:r>
           </w:p>
         </w:tc>
@@ -10099,7 +9918,7 @@
                 <w:color w:val="222222"/>
                 <w:sz w:val="16"/>
               </w:rPr>
-              <w:t>0.9841</w:t>
+              <w:t>0.9837</w:t>
             </w:r>
           </w:p>
         </w:tc>
@@ -10339,7 +10158,7 @@
                 <w:color w:val="222222"/>
                 <w:sz w:val="16"/>
               </w:rPr>
-              <w:t>0.9729</w:t>
+              <w:t>0.9732</w:t>
             </w:r>
           </w:p>
         </w:tc>
@@ -10369,7 +10188,7 @@
                 <w:color w:val="222222"/>
                 <w:sz w:val="16"/>
               </w:rPr>
-              <w:t>0.30,0.00,0.70</w:t>
+              <w:t>0.00,0.00,1.00</w:t>
             </w:r>
           </w:p>
         </w:tc>
@@ -10458,7 +10277,7 @@
                 <w:color w:val="222222"/>
                 <w:sz w:val="16"/>
               </w:rPr>
-              <w:t>0.8268</w:t>
+              <w:t>0.8187</w:t>
             </w:r>
           </w:p>
         </w:tc>
@@ -10579,7 +10398,7 @@
                 <w:color w:val="222222"/>
                 <w:sz w:val="16"/>
               </w:rPr>
-              <w:t>0.9874</w:t>
+              <w:t>0.9875</w:t>
             </w:r>
           </w:p>
         </w:tc>
@@ -10609,7 +10428,7 @@
                 <w:color w:val="222222"/>
                 <w:sz w:val="16"/>
               </w:rPr>
-              <w:t>0.97,0.03,0.00</w:t>
+              <w:t>0.17,0.03,0.80</w:t>
             </w:r>
           </w:p>
         </w:tc>
@@ -10698,7 +10517,7 @@
                 <w:color w:val="222222"/>
                 <w:sz w:val="16"/>
               </w:rPr>
-              <w:t>0.9638</w:t>
+              <w:t>0.9626</w:t>
             </w:r>
           </w:p>
         </w:tc>
@@ -10763,7 +10582,7 @@
           <w:color w:val="222222"/>
           <w:sz w:val="21"/>
         </w:rPr>
-        <w:t>融合权重揭示了目标结构差异。总负债、毛利、营业成本、营业利润和 EBITDA 完全依赖残差模型；股东权益完全依赖 M3d 直接模型；营业费用主要沿用 B4 规则基线。这说明不同财务项目的信息来源不同，统一建模路线会损失目标层面的稳定性。</w:t>
+        <w:t>融合权重揭示了目标结构差异。总负债、毛利、营业成本、收入、营业利润和 EBITDA 完全依赖残差模型；股东权益采用 M3d/M4 的组合，营业费用权重为 B4/M3d/M4 = 0.17,0.03,0.80。这说明不同财务项目的信息来源不同，统一建模路线会损失目标层面的稳定性。</w:t>
       </w:r>
     </w:p>
     <w:p>
@@ -10950,7 +10769,7 @@
       <w:r>
         <w:drawing>
           <wp:inline xmlns:a="http://schemas.openxmlformats.org/drawingml/2006/main" xmlns:pic="http://schemas.openxmlformats.org/drawingml/2006/picture">
-            <wp:extent cx="5472000" cy="2483092"/>
+            <wp:extent cx="5472000" cy="2345143"/>
             <wp:docPr id="13" name="Picture 13"/>
             <wp:cNvGraphicFramePr>
               <a:graphicFrameLocks noChangeAspect="1"/>
@@ -10971,7 +10790,7 @@
                   <pic:spPr>
                     <a:xfrm>
                       <a:off x="0" y="0"/>
-                      <a:ext cx="5472000" cy="2483092"/>
+                      <a:ext cx="5472000" cy="2345143"/>
                     </a:xfrm>
                     <a:prstGeom prst="rect"/>
                   </pic:spPr>
@@ -11208,7 +11027,7 @@
                 <w:color w:val="222222"/>
                 <w:sz w:val="17"/>
               </w:rPr>
-              <w:t>0.8572</w:t>
+              <w:t>0.8491</w:t>
             </w:r>
           </w:p>
         </w:tc>
@@ -11240,7 +11059,7 @@
                 <w:color w:val="222222"/>
                 <w:sz w:val="17"/>
               </w:rPr>
-              <w:t>balance_sheet_equity</w:t>
+              <w:t>gross_profit_identity</w:t>
             </w:r>
           </w:p>
         </w:tc>
@@ -11270,7 +11089,7 @@
                 <w:color w:val="222222"/>
                 <w:sz w:val="17"/>
               </w:rPr>
-              <w:t>0.8367</w:t>
+              <w:t>0.8467</w:t>
             </w:r>
           </w:p>
         </w:tc>
@@ -11301,7 +11120,7 @@
                 <w:color w:val="222222"/>
                 <w:sz w:val="17"/>
               </w:rPr>
-              <w:t>gross_profit_identity</w:t>
+              <w:t>balance_sheet_equity</w:t>
             </w:r>
           </w:p>
         </w:tc>
@@ -11330,7 +11149,7 @@
                 <w:color w:val="222222"/>
                 <w:sz w:val="17"/>
               </w:rPr>
-              <w:t>0.8547</w:t>
+              <w:t>0.8419</w:t>
             </w:r>
           </w:p>
         </w:tc>
@@ -11392,7 +11211,7 @@
                 <w:color w:val="222222"/>
                 <w:sz w:val="17"/>
               </w:rPr>
-              <w:t>0.3626</w:t>
+              <w:t>0.3473</w:t>
             </w:r>
           </w:p>
         </w:tc>
@@ -11452,7 +11271,7 @@
                 <w:color w:val="222222"/>
                 <w:sz w:val="17"/>
               </w:rPr>
-              <w:t>0.3421</w:t>
+              <w:t>0.3353</w:t>
             </w:r>
           </w:p>
         </w:tc>
@@ -11514,7 +11333,7 @@
                 <w:color w:val="222222"/>
                 <w:sz w:val="17"/>
               </w:rPr>
-              <w:t>0.3217</w:t>
+              <w:t>0.3281</w:t>
             </w:r>
           </w:p>
         </w:tc>
@@ -11550,7 +11369,7 @@
           <w:color w:val="222222"/>
           <w:sz w:val="21"/>
         </w:rPr>
-        <w:t>结果显示，none 的平均 R² 为 0.8572，是所有方案中最高。强制 balance_sheet_equity 会把股东权益 R² 从 0.4009 降至 0.2165；强制 operating_income_identity 则会使营业利润 R² 大幅转负。最终提交不做机械会计修正。</w:t>
+        <w:t>结果显示，none 的平均 R² 为 0.8491，是所有方案中最高。强制 balance_sheet_equity 会把股东权益 R² 从 0.3073 降至 0.2424；强制 operating_income_identity 则会使营业利润 R² 降至 -3.6976。最终提交不做机械会计修正。</w:t>
       </w:r>
     </w:p>
     <w:p>
@@ -11792,7 +11611,7 @@
                 <w:color w:val="222222"/>
                 <w:sz w:val="17"/>
               </w:rPr>
-              <w:t>0e4fea2cc080b0a2</w:t>
+              <w:t>4b22ef4e6cbdad3c</w:t>
             </w:r>
           </w:p>
         </w:tc>
@@ -12065,7 +11884,7 @@
                 <w:color w:val="222222"/>
                 <w:sz w:val="17"/>
               </w:rPr>
-              <w:t>c8c777fb68ca7d36</w:t>
+              <w:t>a488f55ba7c5254e</w:t>
             </w:r>
           </w:p>
         </w:tc>
@@ -12240,7 +12059,7 @@
           <w:color w:val="222222"/>
           <w:sz w:val="21"/>
         </w:rPr>
-        <w:t>股东权益目标仍是短板，M6 OOF R² 为 0.4009。该目标可能受重分类、非经常性项目和会计调整影响，历史序列解释力弱于经营类指标。</w:t>
+        <w:t>股东权益目标仍是短板，M6 OOF R² 为 0.3073。该目标可能受重分类、非经常性项目和会计调整影响，历史序列解释力弱于经营类指标。</w:t>
       </w:r>
     </w:p>
     <w:p>

</xml_diff>